<commit_message>
feat: compile JSLHU-compliant scientific article in Word .docx format
</commit_message>
<xml_diff>
--- a/Bai_Bao_Khoa_Hoc_CausalFlowNet.docx
+++ b/Bai_Bao_Khoa_Hoc_CausalFlowNet.docx
@@ -4,37 +4,26 @@
   <w:body>
     <w:p>
       <w:pPr>
-        <w:spacing w:after="0" w:before="0" w:line="240" w:lineRule="auto"/>
-        <w:jc w:val="left"/>
-      </w:pPr>
-      <w:r>
-        <w:rPr>
-          <w:rFonts w:ascii="Times New Roman" w:hAnsi="Times New Roman"/>
-          <w:b/>
-          <w:i w:val="0"/>
-          <w:sz w:val="18"/>
-        </w:rPr>
-        <w:t>JOURNAL OF SCIENCE OF LAC HONG UNIVERSITY</w:t>
-      </w:r>
-    </w:p>
-    <w:p>
-      <w:pPr>
-        <w:spacing w:after="0" w:before="0" w:line="240" w:lineRule="auto"/>
-        <w:jc w:val="left"/>
+        <w:spacing w:after="480"/>
+        <w:jc w:val="right"/>
       </w:pPr>
       <w:r>
         <w:rPr>
           <w:rFonts w:ascii="Times New Roman" w:hAnsi="Times New Roman"/>
           <w:b w:val="0"/>
           <w:i/>
-          <w:sz w:val="18"/>
+          <w:color w:val="808080"/>
+          <w:sz w:val="16"/>
+          <w:rFonts w:ascii="Times New Roman" w:hAnsi="Times New Roman"/>
         </w:rPr>
-        <w:t>Tạp chí Khoa học Lạc Hồng, 2026, Số đặc biệt, 001-006</w:t>
+        <w:t>JSLHU, Vol 18, May 2026</w:t>
+        <w:br/>
+        <w:t>TẠP CHÍ KHOA HỌC ĐẠI HỌC LẠC HỒNG</w:t>
       </w:r>
     </w:p>
     <w:p>
       <w:pPr>
-        <w:spacing w:after="120" w:before="360" w:line="240" w:lineRule="auto"/>
+        <w:spacing w:after="240"/>
         <w:jc w:val="center"/>
       </w:pPr>
       <w:r>
@@ -42,14 +31,16 @@
           <w:rFonts w:ascii="Times New Roman" w:hAnsi="Times New Roman"/>
           <w:b/>
           <w:i w:val="0"/>
-          <w:sz w:val="28"/>
+          <w:color w:val="000000"/>
+          <w:sz w:val="30"/>
+          <w:rFonts w:ascii="Times New Roman" w:hAnsi="Times New Roman"/>
         </w:rPr>
-        <w:t>RESEARCH AND DEVELOPMENT OF A DEEP LEARNING MODEL ARCHITECTURE FOR DISCOVERING NON-LINEAR CAUSAL STRUCTURES FROM TABULAR DATA</w:t>
+        <w:t>CAUSALFLOWNET: A NONLINEAR CAUSAL DISCOVERY FRAMEWORK VIA NORMALIZING FLOWS AND PARALLEL INDEPENDENCE TESTING</w:t>
       </w:r>
     </w:p>
     <w:p>
       <w:pPr>
-        <w:spacing w:after="60" w:before="0" w:line="240" w:lineRule="auto"/>
+        <w:spacing w:after="80"/>
         <w:jc w:val="right"/>
       </w:pPr>
       <w:r>
@@ -57,14 +48,16 @@
           <w:rFonts w:ascii="Times New Roman" w:hAnsi="Times New Roman"/>
           <w:b/>
           <w:i w:val="0"/>
+          <w:color w:val="000000"/>
           <w:sz w:val="22"/>
+          <w:rFonts w:ascii="Times New Roman" w:hAnsi="Times New Roman"/>
         </w:rPr>
-        <w:t>Tran Manh Thai1*, Diep Thi My Hang1, Tran Thanh Phuong1</w:t>
+        <w:t>Trần Mạnh Thái1*, Diệp Thị Mỹ Hằng1, Trần Thanh Phương2</w:t>
       </w:r>
     </w:p>
     <w:p>
       <w:pPr>
-        <w:spacing w:after="240" w:before="0" w:line="240" w:lineRule="auto"/>
+        <w:spacing w:after="360"/>
         <w:jc w:val="right"/>
       </w:pPr>
       <w:r>
@@ -72,122 +65,2467 @@
           <w:rFonts w:ascii="Times New Roman" w:hAnsi="Times New Roman"/>
           <w:b w:val="0"/>
           <w:i/>
-          <w:sz w:val="19"/>
+          <w:color w:val="000000"/>
+          <w:sz w:val="18"/>
+          <w:rFonts w:ascii="Times New Roman" w:hAnsi="Times New Roman"/>
         </w:rPr>
-        <w:t>1Department of Information Technology, Lac Hong University, Dong Nai, Vietnam</w:t>
+        <w:t>1Khoa Công nghệ Thông tin, Trường Đại học Lạc Hồng, Đồng Nai, Việt Nam</w:t>
+        <w:br/>
+        <w:t>2Giảng viên hướng dẫn, Khoa Công nghệ Thông tin, Trường Đại học Lạc Hồng, Đồng Nai, Việt Nam</w:t>
+        <w:br/>
+        <w:t>*Corresponding Author: 122000315@lhu.edu.vn</w:t>
       </w:r>
     </w:p>
     <w:p>
       <w:pPr>
-        <w:spacing w:after="360" w:before="0" w:line="240" w:lineRule="auto"/>
-        <w:jc w:val="right"/>
+        <w:spacing w:before="240" w:after="80"/>
+      </w:pPr>
+      <w:r>
+        <w:rPr>
+          <w:rFonts w:ascii="Times New Roman" w:hAnsi="Times New Roman"/>
+          <w:b/>
+          <w:i w:val="0"/>
+          <w:color w:val="000000"/>
+          <w:sz w:val="20"/>
+          <w:rFonts w:ascii="Times New Roman" w:hAnsi="Times New Roman"/>
+        </w:rPr>
+        <w:t>ABSTRACT</w:t>
+      </w:r>
+    </w:p>
+    <w:p>
+      <w:pPr>
+        <w:spacing w:after="120"/>
+        <w:ind w:left="288" w:right="288"/>
+        <w:jc w:val="both"/>
+      </w:pPr>
+      <w:r>
+        <w:rPr>
+          <w:rFonts w:ascii="Times New Roman" w:hAnsi="Times New Roman"/>
+          <w:b w:val="0"/>
+          <w:i w:val="0"/>
+          <w:color w:val="000000"/>
+          <w:sz w:val="19"/>
+          <w:rFonts w:ascii="Times New Roman" w:hAnsi="Times New Roman"/>
+        </w:rPr>
+        <w:t>Causal discovery from continuous observational data remains a challenging task, particularly when the underlying mechanisms are highly nonlinear and subject to non-Gaussian noise. We introduce CausalFlowNet, a unified deep learning framework for continuous causal structure learning. The proposed architecture leverages a Gated Residual Multi-Layer Perceptron (Gated-ResMLP) to capture complex context-dependent interactions, alongside Neural Spline Flows (NSF) equipped with Gaussian Mixture Priors for flexible and exact density estimation of the residuals. To enforce the fundamental assumption of causal sufficiency—where noise residuals must be statistically independent of their causal parents—we introduce a fully parallelized Hilbert-Schmidt Independence Criterion (HSIC) module accelerated by Random Fourier Features. Optimized via the Augmented Lagrangian Method to strictly guarantee acyclicity, CausalFlowNet demonstrates highly competitive Structural Hamming Distance (SHD) and Structural Intervention Distance (SID) on both real biological datasets and synthetic regulatory networks.</w:t>
+      </w:r>
+    </w:p>
+    <w:p>
+      <w:pPr>
+        <w:spacing w:after="360"/>
+        <w:ind w:left="288"/>
+      </w:pPr>
+      <w:r>
+        <w:rPr>
+          <w:rFonts w:ascii="Times New Roman" w:hAnsi="Times New Roman"/>
+          <w:b/>
+          <w:i w:val="0"/>
+          <w:color w:val="000000"/>
+          <w:sz w:val="19"/>
+          <w:rFonts w:ascii="Times New Roman" w:hAnsi="Times New Roman"/>
+        </w:rPr>
+        <w:t xml:space="preserve">Keywords: </w:t>
+      </w:r>
+      <w:r>
+        <w:rPr>
+          <w:rFonts w:ascii="Times New Roman" w:hAnsi="Times New Roman"/>
+          <w:b w:val="0"/>
+          <w:i w:val="0"/>
+          <w:color w:val="000000"/>
+          <w:sz w:val="19"/>
+          <w:rFonts w:ascii="Times New Roman" w:hAnsi="Times New Roman"/>
+        </w:rPr>
+        <w:t>Causal Discovery; Normalizing Flows; Gated-ResMLP; Fast HSIC; Acyclicity Constraint.</w:t>
+      </w:r>
+    </w:p>
+    <w:p>
+      <w:pPr>
+        <w:spacing w:after="240"/>
+        <w:jc w:val="center"/>
+      </w:pPr>
+      <w:r>
+        <w:rPr>
+          <w:rFonts w:ascii="Times New Roman" w:hAnsi="Times New Roman"/>
+          <w:b/>
+          <w:i w:val="0"/>
+          <w:color w:val="000000"/>
+          <w:sz w:val="30"/>
+          <w:rFonts w:ascii="Times New Roman" w:hAnsi="Times New Roman"/>
+        </w:rPr>
+        <w:t>CAUSALFLOWNET: KHUNG KHÁM PHÁ NHÂN QUẢ PHI TUYẾN TÍNH QUA FLOW CHUẨN HÓA VÀ KIỂM ĐỊNH ĐỘC LẬP SONG SONG</w:t>
+      </w:r>
+    </w:p>
+    <w:p>
+      <w:pPr>
+        <w:spacing w:before="240" w:after="80"/>
+      </w:pPr>
+      <w:r>
+        <w:rPr>
+          <w:rFonts w:ascii="Times New Roman" w:hAnsi="Times New Roman"/>
+          <w:b/>
+          <w:i w:val="0"/>
+          <w:color w:val="000000"/>
+          <w:sz w:val="20"/>
+          <w:rFonts w:ascii="Times New Roman" w:hAnsi="Times New Roman"/>
+        </w:rPr>
+        <w:t>TÓM TẮT</w:t>
+      </w:r>
+    </w:p>
+    <w:p>
+      <w:pPr>
+        <w:spacing w:after="120"/>
+        <w:ind w:left="288" w:right="288"/>
+        <w:jc w:val="both"/>
+      </w:pPr>
+      <w:r>
+        <w:rPr>
+          <w:rFonts w:ascii="Times New Roman" w:hAnsi="Times New Roman"/>
+          <w:b w:val="0"/>
+          <w:i w:val="0"/>
+          <w:color w:val="000000"/>
+          <w:sz w:val="19"/>
+          <w:rFonts w:ascii="Times New Roman" w:hAnsi="Times New Roman"/>
+        </w:rPr>
+        <w:t>Khám phá cấu trúc nhân quả từ dữ liệu quan sát liên tục là một bài toán đầy thách thức, đặc biệt khi các cơ chế tác động phi tuyến tính và chịu ảnh hưởng bởi nhiễu phi chuẩn. Trong nghiên cứu này, chúng tôi đề xuất CausalFlowNet, một khung học sâu thống nhất cho bài toán học cấu trúc nhân quả liên tục. Kiến trúc đề xuất tích hợp mạng Perceptron nhiều lớp có cổng kết nối tắt (Gated-ResMLP) để mô hình hóa các tương tác phi tuyến tính phức tạp, phối hợp với Flow chuẩn hóa dạng nêm (Neural Spline Flow - NSF) tích hợp phân phối tiên nghiệm hỗn hợp Gaussian (GMM Prior) nhằm ước lượng chính xác mật độ xác suất của phần dư. Để đảm bảo giả định nhân quả đủ—trong đó phần dư phải độc lập thống kê với các biến cha nguyên nhân—chúng tôi đưa vào mô-đun kiểm định độc lập thống kê phi tuyến song song (Parallel Fast HSIC) được tăng tốc bằng đặc trưng Fourier ngẫu nhiên. Được tối ưu hóa bằng phương pháp nhân tử Lagrangian tăng cường nhằm đảm bảo tuyệt đối tính không chu trình (DAG), CausalFlowNet đạt hiệu năng vượt trội trên các chỉ số khoảng cách Hamming cấu trúc (SHD) và khoảng cách can thiệp cấu trúc (SID) trên cả mạng tương tác sinh học Sachs thực tế và mạng lưới điều hòa gen giả lập SynTReN.</w:t>
+      </w:r>
+    </w:p>
+    <w:p>
+      <w:pPr>
+        <w:spacing w:after="480"/>
+        <w:ind w:left="288"/>
+      </w:pPr>
+      <w:r>
+        <w:rPr>
+          <w:rFonts w:ascii="Times New Roman" w:hAnsi="Times New Roman"/>
+          <w:b/>
+          <w:i w:val="0"/>
+          <w:color w:val="000000"/>
+          <w:sz w:val="19"/>
+          <w:rFonts w:ascii="Times New Roman" w:hAnsi="Times New Roman"/>
+        </w:rPr>
+        <w:t xml:space="preserve">Từ khóa: </w:t>
+      </w:r>
+      <w:r>
+        <w:rPr>
+          <w:rFonts w:ascii="Times New Roman" w:hAnsi="Times New Roman"/>
+          <w:b w:val="0"/>
+          <w:i w:val="0"/>
+          <w:color w:val="000000"/>
+          <w:sz w:val="19"/>
+          <w:rFonts w:ascii="Times New Roman" w:hAnsi="Times New Roman"/>
+        </w:rPr>
+        <w:t>Khám phá Nhân quả; Flow chuẩn hóa; Gated-ResMLP; Fast HSIC; Ràng buộc phi chu trình.</w:t>
+      </w:r>
+    </w:p>
+    <w:p>
+      <w:pPr>
+        <w:sectPr>
+          <w:pgSz w:w="11909" w:h="16834"/>
+          <w:pgMar w:top="851" w:right="567" w:bottom="851" w:left="1417" w:header="720" w:footer="720" w:gutter="0"/>
+          <w:cols w:space="720"/>
+          <w:docGrid w:linePitch="360"/>
+        </w:sectPr>
+      </w:pPr>
+    </w:p>
+    <w:p>
+      <w:pPr>
+        <w:keepNext/>
+        <w:spacing w:before="240" w:after="120"/>
+        <w:ind w:left="202"/>
+      </w:pPr>
+      <w:r>
+        <w:rPr>
+          <w:rFonts w:ascii="Times New Roman" w:hAnsi="Times New Roman"/>
+          <w:b/>
+          <w:i w:val="0"/>
+          <w:color w:val="000000"/>
+          <w:sz w:val="20"/>
+          <w:rFonts w:ascii="Times New Roman" w:hAnsi="Times New Roman"/>
+        </w:rPr>
+        <w:t>1. GIỚI THIỆU (INTRODUCTION)</w:t>
+      </w:r>
+    </w:p>
+    <w:p>
+      <w:pPr>
+        <w:spacing w:before="0" w:after="120" w:line="240" w:lineRule="auto"/>
+        <w:ind w:firstLine="202"/>
+        <w:jc w:val="both"/>
+      </w:pPr>
+      <w:r>
+        <w:rPr>
+          <w:rFonts w:ascii="Times New Roman" w:hAnsi="Times New Roman"/>
+          <w:b w:val="0"/>
+          <w:i w:val="0"/>
+          <w:color w:val="000000"/>
+          <w:sz w:val="20"/>
+          <w:rFonts w:ascii="Times New Roman" w:hAnsi="Times New Roman"/>
+        </w:rPr>
+        <w:t>Xác định mối quan hệ nhân quả (Causal Discovery) từ dữ liệu quan sát thực nghiệm là nền tảng cốt lõi của các nghiên cứu khoa học thực chứng. Mặc dù các mô hình học máy và học sâu hiện đại đã đạt được những thành công rực rỡ trong các bài toán dự đoán, phần lớn các phương pháp này mới chỉ tập trung khai thác các mối tương quan thống kê (Spurious Correlation) mà chưa bóc tách được đâu là nguyên nhân thực sự dẫn đến kết quả. Sự thiếu sót này gây ra những sai lầm nghiêm trọng khi ứng dụng hệ thống hỗ trợ ra quyết định vào các lĩnh vực quan trọng như y sinh học, chính sách kinh tế công, hay chẩn đoán lỗi hệ thống kỹ thuật phức tạp.</w:t>
+      </w:r>
+    </w:p>
+    <w:p>
+      <w:pPr>
+        <w:spacing w:before="0" w:after="120" w:line="240" w:lineRule="auto"/>
+        <w:ind w:firstLine="202"/>
+        <w:jc w:val="both"/>
+      </w:pPr>
+      <w:r>
+        <w:rPr>
+          <w:rFonts w:ascii="Times New Roman" w:hAnsi="Times New Roman"/>
+          <w:b w:val="0"/>
+          <w:i w:val="0"/>
+          <w:color w:val="000000"/>
+          <w:sz w:val="20"/>
+          <w:rFonts w:ascii="Times New Roman" w:hAnsi="Times New Roman"/>
+        </w:rPr>
+        <w:t>Theo khung lý thuyết nhân quả được hệ thống hóa bởi Judea Pearl [6], cấu trúc nhân quả của một hệ thống đa biến được biểu diễn hiệu quả dưới dạng Đồ thị có hướng không chu trình (Directed Acyclic Graph - DAG). Truyền thống khám phá DAG từ dữ liệu quan sát được chia thành hai trường phái chính: các thuật toán dựa trên ràng buộc độc lập thống kê (Constraint-based) như PC [11], và các phương pháp tối ưu hóa điểm số (Score-based) như GES [2]. Tuy nhiên, các phương pháp này gặp giới hạn nghiêm trọng về khả năng mở rộng (khối lượng biến) và phụ thuộc nặng nề vào các giả định đơn giản hóa như tuyến tính hoặc nhiễu Gaussian.</w:t>
+      </w:r>
+    </w:p>
+    <w:p>
+      <w:pPr>
+        <w:spacing w:before="0" w:after="120" w:line="240" w:lineRule="auto"/>
+        <w:ind w:firstLine="202"/>
+        <w:jc w:val="both"/>
+      </w:pPr>
+      <w:r>
+        <w:rPr>
+          <w:rFonts w:ascii="Times New Roman" w:hAnsi="Times New Roman"/>
+          <w:b w:val="0"/>
+          <w:i w:val="0"/>
+          <w:color w:val="000000"/>
+          <w:sz w:val="20"/>
+          <w:rFonts w:ascii="Times New Roman" w:hAnsi="Times New Roman"/>
+        </w:rPr>
+        <w:t>Một bước ngoặt đột phá đến từ công trình NOTEARS của Zheng et al. [13], khi chuyển đổi bài toán tìm kiếm đồ thị rời rạc trên không gian tổ hợp có độ phức tạp lũy thừa thành bài toán tối ưu hóa liên tục khả vi. Tuy vậy, NOTEARS nguyên bản chỉ giới hạn trong mô hình tuyến tính và nhiễu chuẩn hóa. Tiếp nối NOTEARS, các mô hình học sâu như GraN-DAG [15] và DAG-GNN [9] đã đưa mạng nơ-ron vào học cơ chế phi tuyến nhưng vẫn ngầm giả định các nhiễu tuân theo phân phối Gaussian, làm giảm độ chính xác trên dữ liệu y tế hay xã hội học vốn có nhiễu rất phức tạp, lệch hoặc đa đỉnh.</w:t>
+      </w:r>
+    </w:p>
+    <w:p>
+      <w:pPr>
+        <w:spacing w:before="0" w:after="120" w:line="240" w:lineRule="auto"/>
+        <w:ind w:firstLine="202"/>
+        <w:jc w:val="both"/>
+      </w:pPr>
+      <w:r>
+        <w:rPr>
+          <w:rFonts w:ascii="Times New Roman" w:hAnsi="Times New Roman"/>
+          <w:b w:val="0"/>
+          <w:i w:val="0"/>
+          <w:color w:val="000000"/>
+          <w:sz w:val="20"/>
+          <w:rFonts w:ascii="Times New Roman" w:hAnsi="Times New Roman"/>
+        </w:rPr>
+        <w:t>Để giải quyết các thách thức trên, bài báo này đề xuất CausalFlowNet, một khung học sâu thống nhất cho phép khám phá cấu trúc nhân quả phi tuyến tính mà không cần bất kỳ giả định trước nào về phân phối nhiễu. CausalFlowNet kết hợp: (i) mạng Gated-ResMLP mạnh mẽ để xấp xỉ cơ chế phi tuyến tính; (ii) mô hình dòng chuẩn hóa Neural Spline Flow (NSF) với tiên nghiệm hỗn hợp Gaussian (GMM) để ước lượng chính xác hàm mật độ nhiễu bất kỳ; và (iii) kiểm định độc lập thống kê phi tuyến song song (Parallel Fast HSIC) để cưỡng bức tính nhân quả thực tế. Toàn bộ hệ thống được huấn luyện đầu cuối thông qua phương pháp nhân tử Lagrangian tăng cường.</w:t>
+      </w:r>
+    </w:p>
+    <w:p>
+      <w:pPr>
+        <w:keepNext/>
+        <w:spacing w:before="240" w:after="120"/>
+        <w:ind w:left="202"/>
+      </w:pPr>
+      <w:r>
+        <w:rPr>
+          <w:rFonts w:ascii="Times New Roman" w:hAnsi="Times New Roman"/>
+          <w:b/>
+          <w:i w:val="0"/>
+          <w:color w:val="000000"/>
+          <w:sz w:val="20"/>
+          <w:rFonts w:ascii="Times New Roman" w:hAnsi="Times New Roman"/>
+        </w:rPr>
+        <w:t>2. PHƯƠNG PHÁP ĐỀ XUẤT (METHODOLOGY)</w:t>
+      </w:r>
+    </w:p>
+    <w:p>
+      <w:pPr>
+        <w:keepNext/>
+        <w:spacing w:before="120" w:after="80"/>
+        <w:ind w:left="202"/>
+      </w:pPr>
+      <w:r>
+        <w:rPr>
+          <w:rFonts w:ascii="Times New Roman" w:hAnsi="Times New Roman"/>
+          <w:b/>
+          <w:i/>
+          <w:color w:val="000000"/>
+          <w:sz w:val="20"/>
+          <w:rFonts w:ascii="Times New Roman" w:hAnsi="Times New Roman"/>
+        </w:rPr>
+        <w:t>2.1 Khung Mô hình Nhân quả Phi tuyến ANM</w:t>
+      </w:r>
+    </w:p>
+    <w:p>
+      <w:pPr>
+        <w:spacing w:before="0" w:after="120" w:line="240" w:lineRule="auto"/>
+        <w:ind w:firstLine="202"/>
+        <w:jc w:val="both"/>
+      </w:pPr>
+      <w:r>
+        <w:rPr>
+          <w:rFonts w:ascii="Times New Roman" w:hAnsi="Times New Roman"/>
+          <w:b w:val="0"/>
+          <w:i w:val="0"/>
+          <w:color w:val="000000"/>
+          <w:sz w:val="20"/>
+          <w:rFonts w:ascii="Times New Roman" w:hAnsi="Times New Roman"/>
+        </w:rPr>
+        <w:t>Chúng tôi cụ thể hóa hệ thống mô hình phương trình cấu trúc (Structural Equation Model - SEM) tổng quát dưới dạng Mô hình nhiễu cộng phi tuyến (Nonlinear Additive Noise Model - ANM) [8]:</w:t>
+      </w:r>
+    </w:p>
+    <w:p>
+      <w:pPr>
+        <w:spacing w:before="120" w:after="120"/>
+        <w:jc w:val="center"/>
       </w:pPr>
       <w:r>
         <w:rPr>
           <w:rFonts w:ascii="Times New Roman" w:hAnsi="Times New Roman"/>
           <w:b w:val="0"/>
           <w:i/>
+          <w:color w:val="000000"/>
+          <w:sz w:val="20"/>
+          <w:rFonts w:ascii="Times New Roman" w:hAnsi="Times New Roman"/>
+        </w:rPr>
+        <w:t xml:space="preserve">X_i = f_i(PA_i) + e_i,  </w:t>
+        <w:tab/>
+        <w:t>\forall i = 1, ..., d</w:t>
+      </w:r>
+      <w:r>
+        <w:rPr>
+          <w:rFonts w:ascii="Times New Roman" w:hAnsi="Times New Roman"/>
+          <w:b w:val="0"/>
+          <w:i w:val="0"/>
+          <w:color w:val="000000"/>
+          <w:sz w:val="20"/>
+          <w:rFonts w:ascii="Times New Roman" w:hAnsi="Times New Roman"/>
+        </w:rPr>
+        <w:tab/>
+        <w:tab/>
+        <w:tab/>
+        <w:t>(1)</w:t>
+      </w:r>
+    </w:p>
+    <w:p>
+      <w:pPr>
+        <w:spacing w:before="0" w:after="120" w:line="240" w:lineRule="auto"/>
+        <w:ind w:firstLine="202"/>
+        <w:jc w:val="both"/>
+      </w:pPr>
+      <w:r>
+        <w:rPr>
+          <w:rFonts w:ascii="Times New Roman" w:hAnsi="Times New Roman"/>
+          <w:b w:val="0"/>
+          <w:i w:val="0"/>
+          <w:color w:val="000000"/>
+          <w:sz w:val="20"/>
+          <w:rFonts w:ascii="Times New Roman" w:hAnsi="Times New Roman"/>
+        </w:rPr>
+        <w:t>Trong đó, PA_i đại diện cho các biến cha (parents) trực tiếp của biến X_i trên đồ thị DAG, f_i là hàm cơ chế phi tuyến phi tham số mô tả tác động nhân quả, và e_i là các biến nhiễu ngoại cảnh độc lập thống kê. Với giả định ANM, việc mô hình hóa chính xác hàm cơ chế f_i và kiểm định độc lập của e_i là chìa khóa duy nhất để đảm bảo tính định danh (identifiability) của đồ thị nhân quả phi tuyến từ dữ liệu quan sát tĩnh.</w:t>
+      </w:r>
+    </w:p>
+    <w:p>
+      <w:pPr>
+        <w:keepNext/>
+        <w:spacing w:before="120" w:after="80"/>
+        <w:ind w:left="202"/>
+      </w:pPr>
+      <w:r>
+        <w:rPr>
+          <w:rFonts w:ascii="Times New Roman" w:hAnsi="Times New Roman"/>
+          <w:b/>
+          <w:i/>
+          <w:color w:val="000000"/>
+          <w:sz w:val="20"/>
+          <w:rFonts w:ascii="Times New Roman" w:hAnsi="Times New Roman"/>
+        </w:rPr>
+        <w:t>2.2 Cơ chế Học Phi tuyến với Gated-ResMLP</w:t>
+      </w:r>
+    </w:p>
+    <w:p>
+      <w:pPr>
+        <w:spacing w:before="0" w:after="120" w:line="240" w:lineRule="auto"/>
+        <w:ind w:firstLine="202"/>
+        <w:jc w:val="both"/>
+      </w:pPr>
+      <w:r>
+        <w:rPr>
+          <w:rFonts w:ascii="Times New Roman" w:hAnsi="Times New Roman"/>
+          <w:b w:val="0"/>
+          <w:i w:val="0"/>
+          <w:color w:val="000000"/>
+          <w:sz w:val="20"/>
+          <w:rFonts w:ascii="Times New Roman" w:hAnsi="Times New Roman"/>
+        </w:rPr>
+        <w:t>Để xấp xỉ hàm cơ chế f_i phi tuyến cực kỳ phức tạp, chúng tôi thiết kế mạng Perceptron nhiều lớp tăng cường kết nối tắt có cổng (Gated-ResMLP). Mỗi khối Gated Residual Block thực hiện chuẩn hóa lớp (Layer Normalization), chiếu tuyến tính nhân đôi chiều ẩn, và tách làm hai nhánh song song (Features và Gate) để điều tiết thông tin học được:</w:t>
+      </w:r>
+    </w:p>
+    <w:p>
+      <w:pPr>
+        <w:spacing w:before="120" w:after="120"/>
+        <w:jc w:val="center"/>
+      </w:pPr>
+      <w:r>
+        <w:rPr>
+          <w:rFonts w:ascii="Times New Roman" w:hAnsi="Times New Roman"/>
+          <w:b w:val="0"/>
+          <w:i/>
+          <w:color w:val="000000"/>
+          <w:sz w:val="20"/>
+          <w:rFonts w:ascii="Times New Roman" w:hAnsi="Times New Roman"/>
+        </w:rPr>
+        <w:t>h_{gated} = LeakyReLU(features) \circ \sigma(gate)</w:t>
+      </w:r>
+      <w:r>
+        <w:rPr>
+          <w:rFonts w:ascii="Times New Roman" w:hAnsi="Times New Roman"/>
+          <w:b w:val="0"/>
+          <w:i w:val="0"/>
+          <w:color w:val="000000"/>
+          <w:sz w:val="20"/>
+          <w:rFonts w:ascii="Times New Roman" w:hAnsi="Times New Roman"/>
+        </w:rPr>
+        <w:tab/>
+        <w:tab/>
+        <w:tab/>
+        <w:t>(2)</w:t>
+      </w:r>
+    </w:p>
+    <w:p>
+      <w:pPr>
+        <w:spacing w:before="0" w:after="120" w:line="240" w:lineRule="auto"/>
+        <w:ind w:firstLine="202"/>
+        <w:jc w:val="both"/>
+      </w:pPr>
+      <w:r>
+        <w:rPr>
+          <w:rFonts w:ascii="Times New Roman" w:hAnsi="Times New Roman"/>
+          <w:b w:val="0"/>
+          <w:i w:val="0"/>
+          <w:color w:val="000000"/>
+          <w:sz w:val="20"/>
+          <w:rFonts w:ascii="Times New Roman" w:hAnsi="Times New Roman"/>
+        </w:rPr>
+        <w:t>Cơ chế này cho phép mạng nơ-ron chủ động chọn lọc thông tin quan trọng và ổn định dòng truyền gradient qua nhiều lớp sâu. Toàn bộ dữ liệu X đầu vào được lọc qua cơ chế mặt nạ mềm (soft-masking) khả vi dựa trên ma trận kề trọng số W:</w:t>
+      </w:r>
+    </w:p>
+    <w:p>
+      <w:pPr>
+        <w:spacing w:before="120" w:after="120"/>
+        <w:jc w:val="center"/>
+      </w:pPr>
+      <w:r>
+        <w:rPr>
+          <w:rFonts w:ascii="Times New Roman" w:hAnsi="Times New Roman"/>
+          <w:b w:val="0"/>
+          <w:i/>
+          <w:color w:val="000000"/>
+          <w:sz w:val="20"/>
+          <w:rFonts w:ascii="Times New Roman" w:hAnsi="Times New Roman"/>
+        </w:rPr>
+        <w:t>X_{masked, i} = X \circ W_{:, i}</w:t>
+      </w:r>
+      <w:r>
+        <w:rPr>
+          <w:rFonts w:ascii="Times New Roman" w:hAnsi="Times New Roman"/>
+          <w:b w:val="0"/>
+          <w:i w:val="0"/>
+          <w:color w:val="000000"/>
+          <w:sz w:val="20"/>
+          <w:rFonts w:ascii="Times New Roman" w:hAnsi="Times New Roman"/>
+        </w:rPr>
+        <w:tab/>
+        <w:tab/>
+        <w:tab/>
+        <w:t>(3)</w:t>
+      </w:r>
+    </w:p>
+    <w:p>
+      <w:pPr>
+        <w:spacing w:before="0" w:after="120" w:line="240" w:lineRule="auto"/>
+        <w:ind w:firstLine="202"/>
+        <w:jc w:val="both"/>
+      </w:pPr>
+      <w:r>
+        <w:rPr>
+          <w:rFonts w:ascii="Times New Roman" w:hAnsi="Times New Roman"/>
+          <w:b w:val="0"/>
+          <w:i w:val="0"/>
+          <w:color w:val="000000"/>
+          <w:sz w:val="20"/>
+          <w:rFonts w:ascii="Times New Roman" w:hAnsi="Times New Roman"/>
+        </w:rPr>
+        <w:t>Cơ chế chia sẻ trọng số (shared weights) được áp dụng trên tất cả d biến số giúp giảm đáng kể lượng tham số cần học từ O(d * p) xuống O(p), cực kỳ tối ưu khi lượng mẫu nhỏ.</w:t>
+      </w:r>
+    </w:p>
+    <w:p>
+      <w:pPr>
+        <w:keepNext/>
+        <w:spacing w:before="120" w:after="80"/>
+        <w:ind w:left="202"/>
+      </w:pPr>
+      <w:r>
+        <w:rPr>
+          <w:rFonts w:ascii="Times New Roman" w:hAnsi="Times New Roman"/>
+          <w:b/>
+          <w:i/>
+          <w:color w:val="000000"/>
+          <w:sz w:val="20"/>
+          <w:rFonts w:ascii="Times New Roman" w:hAnsi="Times New Roman"/>
+        </w:rPr>
+        <w:t>2.3 Ước lượng Mật độ Nhiễu bằng Neural Spline Flow</w:t>
+      </w:r>
+    </w:p>
+    <w:p>
+      <w:pPr>
+        <w:spacing w:before="0" w:after="120" w:line="240" w:lineRule="auto"/>
+        <w:ind w:firstLine="202"/>
+        <w:jc w:val="both"/>
+      </w:pPr>
+      <w:r>
+        <w:rPr>
+          <w:rFonts w:ascii="Times New Roman" w:hAnsi="Times New Roman"/>
+          <w:b w:val="0"/>
+          <w:i w:val="0"/>
+          <w:color w:val="000000"/>
+          <w:sz w:val="20"/>
+          <w:rFonts w:ascii="Times New Roman" w:hAnsi="Times New Roman"/>
+        </w:rPr>
+        <w:t>Thay vì tối thiểu hóa sai số bình phương (MSE) vốn tương đương với việc ngầm ép buộc nhiễu e_i tuân theo phân phối chuẩn Gaussian đơn giản, CausalFlowNet ứng dụng Flow chuẩn hóa dạng nêm (Neural Spline Flow - NSF) [3] kết hợp lớp ghép rational-quadratic splines (RQS).</w:t>
+      </w:r>
+    </w:p>
+    <w:p>
+      <w:pPr>
+        <w:spacing w:before="0" w:after="120" w:line="240" w:lineRule="auto"/>
+        <w:ind w:firstLine="202"/>
+        <w:jc w:val="both"/>
+      </w:pPr>
+      <w:r>
+        <w:rPr>
+          <w:rFonts w:ascii="Times New Roman" w:hAnsi="Times New Roman"/>
+          <w:b w:val="0"/>
+          <w:i w:val="0"/>
+          <w:color w:val="000000"/>
+          <w:sz w:val="20"/>
+          <w:rFonts w:ascii="Times New Roman" w:hAnsi="Times New Roman"/>
+        </w:rPr>
+        <w:t>RQS thực hiện chia miền phần dư thành các đoạn nhỏ (bins) và xấp xỉ trơn bằng các hàm hữu tỷ bậc hai khả vi và khả nghịch theo dạng giải tích. Để mô hình hóa phân phối đa chế độ (multi-modal) của dữ liệu thực tế, chúng tôi tích hợp phân phối tiên nghiệm hỗn hợp Gaussian (GMM Prior) có thể học được tham số:</w:t>
+      </w:r>
+    </w:p>
+    <w:p>
+      <w:pPr>
+        <w:spacing w:before="120" w:after="120"/>
+        <w:jc w:val="center"/>
+      </w:pPr>
+      <w:r>
+        <w:rPr>
+          <w:rFonts w:ascii="Times New Roman" w:hAnsi="Times New Roman"/>
+          <w:b w:val="0"/>
+          <w:i/>
+          <w:color w:val="000000"/>
+          <w:sz w:val="20"/>
+          <w:rFonts w:ascii="Times New Roman" w:hAnsi="Times New Roman"/>
+        </w:rPr>
+        <w:t>p(z) = \sum_{k=1}^K \pi_k N(z | \mu_k, \sigma_k^2)</w:t>
+      </w:r>
+      <w:r>
+        <w:rPr>
+          <w:rFonts w:ascii="Times New Roman" w:hAnsi="Times New Roman"/>
+          <w:b w:val="0"/>
+          <w:i w:val="0"/>
+          <w:color w:val="000000"/>
+          <w:sz w:val="20"/>
+          <w:rFonts w:ascii="Times New Roman" w:hAnsi="Times New Roman"/>
+        </w:rPr>
+        <w:tab/>
+        <w:tab/>
+        <w:tab/>
+        <w:t>(4)</w:t>
+      </w:r>
+    </w:p>
+    <w:p>
+      <w:pPr>
+        <w:spacing w:before="0" w:after="120" w:line="240" w:lineRule="auto"/>
+        <w:ind w:firstLine="202"/>
+        <w:jc w:val="both"/>
+      </w:pPr>
+      <w:r>
+        <w:rPr>
+          <w:rFonts w:ascii="Times New Roman" w:hAnsi="Times New Roman"/>
+          <w:b w:val="0"/>
+          <w:i w:val="0"/>
+          <w:color w:val="000000"/>
+          <w:sz w:val="20"/>
+          <w:rFonts w:ascii="Times New Roman" w:hAnsi="Times New Roman"/>
+        </w:rPr>
+        <w:t>Thông qua định lý đổi biến, NSF tính toán chính xác Log-Likelihood thực tế của phần dư, đóng vai trò làm thành phần tối ưu hóa chính cho hàm mất mát âm Log-Likelihood (NLL) nhằm đẩy phần dư e_i về trạng thái nhiễu sạch nhất.</w:t>
+      </w:r>
+    </w:p>
+    <w:p>
+      <w:pPr>
+        <w:keepNext/>
+        <w:spacing w:before="120" w:after="80"/>
+        <w:ind w:left="202"/>
+      </w:pPr>
+      <w:r>
+        <w:rPr>
+          <w:rFonts w:ascii="Times New Roman" w:hAnsi="Times New Roman"/>
+          <w:b/>
+          <w:i/>
+          <w:color w:val="000000"/>
+          <w:sz w:val="20"/>
+          <w:rFonts w:ascii="Times New Roman" w:hAnsi="Times New Roman"/>
+        </w:rPr>
+        <w:t>2.4 Kiểm định Độc lập Phi tuyến Song song bằng Fast HSIC</w:t>
+      </w:r>
+    </w:p>
+    <w:p>
+      <w:pPr>
+        <w:spacing w:before="0" w:after="120" w:line="240" w:lineRule="auto"/>
+        <w:ind w:firstLine="202"/>
+        <w:jc w:val="both"/>
+      </w:pPr>
+      <w:r>
+        <w:rPr>
+          <w:rFonts w:ascii="Times New Roman" w:hAnsi="Times New Roman"/>
+          <w:b w:val="0"/>
+          <w:i w:val="0"/>
+          <w:color w:val="000000"/>
+          <w:sz w:val="20"/>
+          <w:rFonts w:ascii="Times New Roman" w:hAnsi="Times New Roman"/>
+        </w:rPr>
+        <w:t>Để đảm bảo tuyệt đối điều kiện e_i độc lập với PA_i, chúng tôi tích hợp tiêu chuẩn độc lập Hilbert-Schmidt (HSIC) [4]. Do tính toán HSIC gốc có độ phức tạp rất lớn O(N^2) không thể tối ưu hóa theo lô lớn, chúng tôi sử dụng phương pháp xấp xỉ nhanh bằng đặc trưng Fourier ngẫu nhiên (Random Fourier Features - RFF) để biến đổi các đặc trưng phi tuyến thành các phép chiếu tuyến tính trong không gian Fourier ẩn:</w:t>
+      </w:r>
+    </w:p>
+    <w:p>
+      <w:pPr>
+        <w:spacing w:before="120" w:after="120"/>
+        <w:jc w:val="center"/>
+      </w:pPr>
+      <w:r>
+        <w:rPr>
+          <w:rFonts w:ascii="Times New Roman" w:hAnsi="Times New Roman"/>
+          <w:b w:val="0"/>
+          <w:i/>
+          <w:color w:val="000000"/>
+          <w:sz w:val="20"/>
+          <w:rFonts w:ascii="Times New Roman" w:hAnsi="Times New Roman"/>
+        </w:rPr>
+        <w:t>k(x, y) \approx \Phi(x)^T \Phi(y)</w:t>
+      </w:r>
+      <w:r>
+        <w:rPr>
+          <w:rFonts w:ascii="Times New Roman" w:hAnsi="Times New Roman"/>
+          <w:b w:val="0"/>
+          <w:i w:val="0"/>
+          <w:color w:val="000000"/>
+          <w:sz w:val="20"/>
+          <w:rFonts w:ascii="Times New Roman" w:hAnsi="Times New Roman"/>
+        </w:rPr>
+        <w:tab/>
+        <w:tab/>
+        <w:tab/>
+        <w:t>(5)</w:t>
+      </w:r>
+    </w:p>
+    <w:p>
+      <w:pPr>
+        <w:spacing w:before="0" w:after="120" w:line="240" w:lineRule="auto"/>
+        <w:ind w:firstLine="202"/>
+        <w:jc w:val="both"/>
+      </w:pPr>
+      <w:r>
+        <w:rPr>
+          <w:rFonts w:ascii="Times New Roman" w:hAnsi="Times New Roman"/>
+          <w:b w:val="0"/>
+          <w:i w:val="0"/>
+          <w:color w:val="000000"/>
+          <w:sz w:val="20"/>
+          <w:rFonts w:ascii="Times New Roman" w:hAnsi="Times New Roman"/>
+        </w:rPr>
+        <w:t>Toàn bộ các cặp biến số được kiểm định độc lập phi tuyến đồng thời trong một phép toán nhân ma trận theo lô duy nhất trên GPU/CPU, nâng cao tốc độ tính toán lên d lần so với tuần tự.</w:t>
+      </w:r>
+    </w:p>
+    <w:p>
+      <w:pPr>
+        <w:keepNext/>
+        <w:spacing w:before="120" w:after="80"/>
+        <w:ind w:left="202"/>
+      </w:pPr>
+      <w:r>
+        <w:rPr>
+          <w:rFonts w:ascii="Times New Roman" w:hAnsi="Times New Roman"/>
+          <w:b/>
+          <w:i/>
+          <w:color w:val="000000"/>
+          <w:sz w:val="20"/>
+          <w:rFonts w:ascii="Times New Roman" w:hAnsi="Times New Roman"/>
+        </w:rPr>
+        <w:t>2.5 Tối ưu hóa ràng buộc chu trình liên tục</w:t>
+      </w:r>
+    </w:p>
+    <w:p>
+      <w:pPr>
+        <w:spacing w:before="0" w:after="120" w:line="240" w:lineRule="auto"/>
+        <w:ind w:firstLine="202"/>
+        <w:jc w:val="both"/>
+      </w:pPr>
+      <w:r>
+        <w:rPr>
+          <w:rFonts w:ascii="Times New Roman" w:hAnsi="Times New Roman"/>
+          <w:b w:val="0"/>
+          <w:i w:val="0"/>
+          <w:color w:val="000000"/>
+          <w:sz w:val="20"/>
+          <w:rFonts w:ascii="Times New Roman" w:hAnsi="Times New Roman"/>
+        </w:rPr>
+        <w:t>Chúng tôi định nghĩa ràng buộc phi chu trình liên tục h(W) theo công thức của NOTEARS:</w:t>
+      </w:r>
+    </w:p>
+    <w:p>
+      <w:pPr>
+        <w:spacing w:before="120" w:after="120"/>
+        <w:jc w:val="center"/>
+      </w:pPr>
+      <w:r>
+        <w:rPr>
+          <w:rFonts w:ascii="Times New Roman" w:hAnsi="Times New Roman"/>
+          <w:b w:val="0"/>
+          <w:i/>
+          <w:color w:val="000000"/>
+          <w:sz w:val="20"/>
+          <w:rFonts w:ascii="Times New Roman" w:hAnsi="Times New Roman"/>
+        </w:rPr>
+        <w:t>h(W) = Tr(e^{W \circ W}) - d = 0</w:t>
+      </w:r>
+      <w:r>
+        <w:rPr>
+          <w:rFonts w:ascii="Times New Roman" w:hAnsi="Times New Roman"/>
+          <w:b w:val="0"/>
+          <w:i w:val="0"/>
+          <w:color w:val="000000"/>
+          <w:sz w:val="20"/>
+          <w:rFonts w:ascii="Times New Roman" w:hAnsi="Times New Roman"/>
+        </w:rPr>
+        <w:tab/>
+        <w:tab/>
+        <w:tab/>
+        <w:t>(6)</w:t>
+      </w:r>
+    </w:p>
+    <w:p>
+      <w:pPr>
+        <w:spacing w:before="0" w:after="120" w:line="240" w:lineRule="auto"/>
+        <w:ind w:firstLine="202"/>
+        <w:jc w:val="both"/>
+      </w:pPr>
+      <w:r>
+        <w:rPr>
+          <w:rFonts w:ascii="Times New Roman" w:hAnsi="Times New Roman"/>
+          <w:b w:val="0"/>
+          <w:i w:val="0"/>
+          <w:color w:val="000000"/>
+          <w:sz w:val="20"/>
+          <w:rFonts w:ascii="Times New Roman" w:hAnsi="Times New Roman"/>
+        </w:rPr>
+        <w:t>Để tích hợp ràng buộc cứng h(W) = 0 vào bài toán tối ưu hóa khả vi, phương pháp nhân tử Lagrangian tăng cường (Augmented Lagrangian Method - ALM) được sử dụng để xây dựng hàm mục tiêu mở rộng L_aug:</w:t>
+      </w:r>
+    </w:p>
+    <w:p>
+      <w:pPr>
+        <w:spacing w:before="120" w:after="120"/>
+        <w:jc w:val="center"/>
+      </w:pPr>
+      <w:r>
+        <w:rPr>
+          <w:rFonts w:ascii="Times New Roman" w:hAnsi="Times New Roman"/>
+          <w:b w:val="0"/>
+          <w:i/>
+          <w:color w:val="000000"/>
+          <w:sz w:val="20"/>
+          <w:rFonts w:ascii="Times New Roman" w:hAnsi="Times New Roman"/>
+        </w:rPr>
+        <w:t>L_{aug}(W, \alpha, \rho) = L(W) + \alpha h(W) + \frac{\rho}{2} h(W)^2</w:t>
+      </w:r>
+      <w:r>
+        <w:rPr>
+          <w:rFonts w:ascii="Times New Roman" w:hAnsi="Times New Roman"/>
+          <w:b w:val="0"/>
+          <w:i w:val="0"/>
+          <w:color w:val="000000"/>
+          <w:sz w:val="20"/>
+          <w:rFonts w:ascii="Times New Roman" w:hAnsi="Times New Roman"/>
+        </w:rPr>
+        <w:tab/>
+        <w:tab/>
+        <w:tab/>
+        <w:t>(7)</w:t>
+      </w:r>
+    </w:p>
+    <w:p>
+      <w:pPr>
+        <w:spacing w:before="0" w:after="120" w:line="240" w:lineRule="auto"/>
+        <w:ind w:firstLine="202"/>
+        <w:jc w:val="both"/>
+      </w:pPr>
+      <w:r>
+        <w:rPr>
+          <w:rFonts w:ascii="Times New Roman" w:hAnsi="Times New Roman"/>
+          <w:b w:val="0"/>
+          <w:i w:val="0"/>
+          <w:color w:val="000000"/>
+          <w:sz w:val="20"/>
+          <w:rFonts w:ascii="Times New Roman" w:hAnsi="Times New Roman"/>
+        </w:rPr>
+        <w:t>Trong đó L(W) = NLL(W) + \lambda_{HSIC} L_{HSIC}(W) + \lambda_{L1} |W|_1. ALM tổ chức tối ưu hóa theo cơ chế vòng lặp kép (dual-loop) tự động điều chỉnh độ phạt nghiêm khắc qua các epoch nhằm ép ma trận kề W hội tụ về một DAG hoàn hảo.</w:t>
+      </w:r>
+    </w:p>
+    <w:p>
+      <w:pPr>
+        <w:keepNext/>
+        <w:spacing w:before="240" w:after="120"/>
+        <w:ind w:left="202"/>
+      </w:pPr>
+      <w:r>
+        <w:rPr>
+          <w:rFonts w:ascii="Times New Roman" w:hAnsi="Times New Roman"/>
+          <w:b/>
+          <w:i w:val="0"/>
+          <w:color w:val="000000"/>
+          <w:sz w:val="20"/>
+          <w:rFonts w:ascii="Times New Roman" w:hAnsi="Times New Roman"/>
+        </w:rPr>
+        <w:t>3. KẾT QUẢ THỰC NGHIỆM (EXPERIMENTAL RESULTS)</w:t>
+      </w:r>
+    </w:p>
+    <w:p>
+      <w:pPr>
+        <w:keepNext/>
+        <w:spacing w:before="120" w:after="80"/>
+        <w:ind w:left="202"/>
+      </w:pPr>
+      <w:r>
+        <w:rPr>
+          <w:rFonts w:ascii="Times New Roman" w:hAnsi="Times New Roman"/>
+          <w:b/>
+          <w:i/>
+          <w:color w:val="000000"/>
+          <w:sz w:val="20"/>
+          <w:rFonts w:ascii="Times New Roman" w:hAnsi="Times New Roman"/>
+        </w:rPr>
+        <w:t>3.1 Thiết lập thực nghiệm</w:t>
+      </w:r>
+    </w:p>
+    <w:p>
+      <w:pPr>
+        <w:spacing w:before="0" w:after="120" w:line="240" w:lineRule="auto"/>
+        <w:ind w:firstLine="202"/>
+        <w:jc w:val="both"/>
+      </w:pPr>
+      <w:r>
+        <w:rPr>
+          <w:rFonts w:ascii="Times New Roman" w:hAnsi="Times New Roman"/>
+          <w:b w:val="0"/>
+          <w:i w:val="0"/>
+          <w:color w:val="000000"/>
+          <w:sz w:val="20"/>
+          <w:rFonts w:ascii="Times New Roman" w:hAnsi="Times New Roman"/>
+        </w:rPr>
+        <w:t>Chúng tôi kiểm thử CausalFlowNet trên hai tập dữ liệu benchmark sinh học chuẩn quốc tế: 1. Tập dữ liệu Sachs thực tế (7,466 mẫu, 11 protein truyền tín hiệu tế bào miễn dịch) [9]. 2. Tập dữ liệu giả lập mạng lưới điều hòa gen SynTReN (20 biến số mô phỏng động học phi tuyến Michaelis-Menten) [12]. Các chỉ số đánh giá bao gồm: Structural Hamming Distance (SHD - đo số lỗi cấu trúc), Structural Intervention Distance (SID - sai số can thiệp do-calculus), và True Positive Rate (TPR).</w:t>
+      </w:r>
+    </w:p>
+    <w:p>
+      <w:pPr>
+        <w:keepNext/>
+        <w:spacing w:before="240" w:after="80"/>
+        <w:jc w:val="center"/>
+      </w:pPr>
+      <w:r>
+        <w:rPr>
+          <w:rFonts w:ascii="Times New Roman" w:hAnsi="Times New Roman"/>
+          <w:b/>
+          <w:i w:val="0"/>
+          <w:color w:val="000000"/>
           <w:sz w:val="18"/>
+          <w:rFonts w:ascii="Times New Roman" w:hAnsi="Times New Roman"/>
         </w:rPr>
-        <w:t>*Corresponding Author Email: manhtran.lhu@gmail.com</w:t>
+        <w:t>Bảng 1. Bảng tổng hợp kết quả so sánh đối chứng hiệu năng các mô hình.</w:t>
       </w:r>
     </w:p>
     <w:tbl>
       <w:tblPr>
         <w:tblW w:type="auto" w:w="0"/>
-        <w:tblLayout w:type="fixed"/>
+        <w:jc w:val="center"/>
         <w:tblLook w:firstColumn="1" w:firstRow="1" w:lastColumn="0" w:lastRow="0" w:noHBand="0" w:noVBand="1" w:val="04A0"/>
+        <w:tblBorders>
+          <w:top w:val="single" w:sz="8" w:space="0" w:color="000000"/>
+          <w:bottom w:val="single" w:sz="8" w:space="0" w:color="000000"/>
+          <w:insideH w:val="single" w:sz="4" w:space="0" w:color="000000"/>
+        </w:tblBorders>
       </w:tblPr>
       <w:tblGrid>
-        <w:gridCol w:w="2592"/>
-        <w:gridCol w:w="7344"/>
+        <w:gridCol w:w="1418"/>
+        <w:gridCol w:w="1418"/>
+        <w:gridCol w:w="1418"/>
+        <w:gridCol w:w="1418"/>
+        <w:gridCol w:w="1418"/>
+        <w:gridCol w:w="1418"/>
+        <w:gridCol w:w="1418"/>
       </w:tblGrid>
       <w:tr>
         <w:tc>
           <w:tcPr>
-            <w:tcW w:type="dxa" w:w="4968"/>
-            <w:tcMar>
-              <w:top w:w="60" w:type="dxa"/>
-              <w:bottom w:w="60" w:type="dxa"/>
-              <w:left w:w="60" w:type="dxa"/>
-              <w:right w:w="60" w:type="dxa"/>
-            </w:tcMar>
+            <w:tcW w:type="dxa" w:w="1418"/>
           </w:tcPr>
           <w:p>
             <w:pPr>
-              <w:spacing w:after="40"/>
+              <w:spacing w:before="40" w:after="40"/>
+              <w:jc w:val="center"/>
             </w:pPr>
             <w:r>
               <w:rPr>
+                <w:rFonts w:ascii="Times New Roman" w:hAnsi="Times New Roman"/>
                 <w:b/>
+                <w:i w:val="0"/>
+                <w:color w:val="000000"/>
+                <w:sz w:val="18"/>
+                <w:rFonts w:ascii="Times New Roman" w:hAnsi="Times New Roman"/>
               </w:rPr>
-              <w:t>ARTICLE INFO</w:t>
-              <w:br/>
-            </w:r>
-            <w:r>
-              <w:rPr>
-                <w:sz w:val="17"/>
-              </w:rPr>
-              <w:t>Received: May 15, 2026</w:t>
-              <w:br/>
-              <w:t>Revised: May 20, 2026</w:t>
-              <w:br/>
-              <w:t>Accepted: May 24, 2026</w:t>
-              <w:br/>
-              <w:t>Published: May 27, 2026</w:t>
-              <w:br/>
-              <w:br/>
-            </w:r>
-            <w:r>
-              <w:rPr>
-                <w:b/>
-              </w:rPr>
-              <w:t>KEYWORDS</w:t>
-              <w:br/>
-            </w:r>
-            <w:r>
-              <w:rPr>
-                <w:sz w:val="17"/>
-              </w:rPr>
-              <w:t>Causal Discovery;</w:t>
-              <w:br/>
-              <w:t>Deep Learning;</w:t>
-              <w:br/>
-              <w:t>Normalizing Flows;</w:t>
-              <w:br/>
-              <w:t>Fast HSIC;</w:t>
-              <w:br/>
-              <w:t>Gated-ResMLP.</w:t>
+              <w:t>Phương pháp</w:t>
             </w:r>
           </w:p>
         </w:tc>
         <w:tc>
           <w:tcPr>
-            <w:tcW w:type="dxa" w:w="4968"/>
-            <w:tcMar>
-              <w:top w:w="60" w:type="dxa"/>
-              <w:bottom w:w="60" w:type="dxa"/>
-              <w:left w:w="60" w:type="dxa"/>
-              <w:right w:w="60" w:type="dxa"/>
-            </w:tcMar>
+            <w:tcW w:type="dxa" w:w="1418"/>
           </w:tcPr>
           <w:p>
             <w:pPr>
-              <w:spacing w:line="240" w:lineRule="auto"/>
-              <w:jc w:val="both"/>
+              <w:spacing w:before="40" w:after="40"/>
+              <w:jc w:val="center"/>
             </w:pPr>
             <w:r>
               <w:rPr>
+                <w:rFonts w:ascii="Times New Roman" w:hAnsi="Times New Roman"/>
                 <w:b/>
+                <w:i w:val="0"/>
+                <w:color w:val="000000"/>
+                <w:sz w:val="18"/>
+                <w:rFonts w:ascii="Times New Roman" w:hAnsi="Times New Roman"/>
               </w:rPr>
-              <w:t>ABSTRACT</w:t>
-              <w:br/>
+              <w:t>SHD (Sachs)</w:t>
             </w:r>
+          </w:p>
+        </w:tc>
+        <w:tc>
+          <w:tcPr>
+            <w:tcW w:type="dxa" w:w="1418"/>
+          </w:tcPr>
+          <w:p>
+            <w:pPr>
+              <w:spacing w:before="40" w:after="40"/>
+              <w:jc w:val="center"/>
+            </w:pPr>
             <w:r>
               <w:rPr>
+                <w:rFonts w:ascii="Times New Roman" w:hAnsi="Times New Roman"/>
+                <w:b/>
+                <w:i w:val="0"/>
+                <w:color w:val="000000"/>
                 <w:sz w:val="18"/>
+                <w:rFonts w:ascii="Times New Roman" w:hAnsi="Times New Roman"/>
               </w:rPr>
-              <w:t>Discovering causal structures from observational data is a fundamental challenge in machine learning and statistics. Traditional approaches often assume linear relationships or simple Gaussian noise models, which restrict their efficacy on real-world datasets characterized by non-linear interactions and complex noise distributions. In this study, we propose CausalFlowNet, a novel deep learning framework that integrates Gated Residual Multi-Layer Perceptrons (Gated-ResMLP) with Neural Spline Flows (NSF) under the Augmented Lagrangian optimization framework. Specifically, the Gated-ResMLP learns the complex non-linear causal functions, while the NSF models arbitrary, non-Gaussian residual noise distributions using rational-quadratic splines. To ensure true causal directionality, we introduce the Parallel Fast Hilbert-Schmidt Independence Criterion (Fast HSIC) as a statistical independence regularizer. Experimental evaluations on the benchmark Sachs protein signaling dataset and synthetic SynTReN gene networks demonstrate that CausalFlowNet achieves superior performance, obtaining a Structural Hamming Distance (SHD) of 12.0 and structural intervention distance (SID) of 37.0, outperforming existing baselines like NOTEARS, DAG-GNN, and GraN-DAG. The model provides a robust and scalable solution for discovering non-linear causal networks from tabular observational data.</w:t>
+              <w:t>SHD-c (Sachs)</w:t>
+            </w:r>
+          </w:p>
+        </w:tc>
+        <w:tc>
+          <w:tcPr>
+            <w:tcW w:type="dxa" w:w="1418"/>
+          </w:tcPr>
+          <w:p>
+            <w:pPr>
+              <w:spacing w:before="40" w:after="40"/>
+              <w:jc w:val="center"/>
+            </w:pPr>
+            <w:r>
+              <w:rPr>
+                <w:rFonts w:ascii="Times New Roman" w:hAnsi="Times New Roman"/>
+                <w:b/>
+                <w:i w:val="0"/>
+                <w:color w:val="000000"/>
+                <w:sz w:val="18"/>
+                <w:rFonts w:ascii="Times New Roman" w:hAnsi="Times New Roman"/>
+              </w:rPr>
+              <w:t>SID (Sachs)</w:t>
+            </w:r>
+          </w:p>
+        </w:tc>
+        <w:tc>
+          <w:tcPr>
+            <w:tcW w:type="dxa" w:w="1418"/>
+          </w:tcPr>
+          <w:p>
+            <w:pPr>
+              <w:spacing w:before="40" w:after="40"/>
+              <w:jc w:val="center"/>
+            </w:pPr>
+            <w:r>
+              <w:rPr>
+                <w:rFonts w:ascii="Times New Roman" w:hAnsi="Times New Roman"/>
+                <w:b/>
+                <w:i w:val="0"/>
+                <w:color w:val="000000"/>
+                <w:sz w:val="18"/>
+                <w:rFonts w:ascii="Times New Roman" w:hAnsi="Times New Roman"/>
+              </w:rPr>
+              <w:t>SHD (SynTReN)</w:t>
+            </w:r>
+          </w:p>
+        </w:tc>
+        <w:tc>
+          <w:tcPr>
+            <w:tcW w:type="dxa" w:w="1418"/>
+          </w:tcPr>
+          <w:p>
+            <w:pPr>
+              <w:spacing w:before="40" w:after="40"/>
+              <w:jc w:val="center"/>
+            </w:pPr>
+            <w:r>
+              <w:rPr>
+                <w:rFonts w:ascii="Times New Roman" w:hAnsi="Times New Roman"/>
+                <w:b/>
+                <w:i w:val="0"/>
+                <w:color w:val="000000"/>
+                <w:sz w:val="18"/>
+                <w:rFonts w:ascii="Times New Roman" w:hAnsi="Times New Roman"/>
+              </w:rPr>
+              <w:t>SHD-c (SynTReN)</w:t>
+            </w:r>
+          </w:p>
+        </w:tc>
+        <w:tc>
+          <w:tcPr>
+            <w:tcW w:type="dxa" w:w="1418"/>
+          </w:tcPr>
+          <w:p>
+            <w:pPr>
+              <w:spacing w:before="40" w:after="40"/>
+              <w:jc w:val="center"/>
+            </w:pPr>
+            <w:r>
+              <w:rPr>
+                <w:rFonts w:ascii="Times New Roman" w:hAnsi="Times New Roman"/>
+                <w:b/>
+                <w:i w:val="0"/>
+                <w:color w:val="000000"/>
+                <w:sz w:val="18"/>
+                <w:rFonts w:ascii="Times New Roman" w:hAnsi="Times New Roman"/>
+              </w:rPr>
+              <w:t>SID (SynTReN)</w:t>
+            </w:r>
+          </w:p>
+        </w:tc>
+      </w:tr>
+      <w:tr>
+        <w:tc>
+          <w:tcPr>
+            <w:tcW w:type="dxa" w:w="1418"/>
+          </w:tcPr>
+          <w:p>
+            <w:pPr>
+              <w:spacing w:before="40" w:after="40"/>
+              <w:jc w:val="left"/>
+            </w:pPr>
+            <w:r>
+              <w:rPr>
+                <w:rFonts w:ascii="Times New Roman" w:hAnsi="Times New Roman"/>
+                <w:b/>
+                <w:i w:val="0"/>
+                <w:color w:val="000000"/>
+                <w:sz w:val="18"/>
+                <w:rFonts w:ascii="Times New Roman" w:hAnsi="Times New Roman"/>
+              </w:rPr>
+              <w:t>GraN-DAG</w:t>
+            </w:r>
+          </w:p>
+        </w:tc>
+        <w:tc>
+          <w:tcPr>
+            <w:tcW w:type="dxa" w:w="1418"/>
+          </w:tcPr>
+          <w:p>
+            <w:pPr>
+              <w:spacing w:before="40" w:after="40"/>
+              <w:jc w:val="center"/>
+            </w:pPr>
+            <w:r>
+              <w:rPr>
+                <w:rFonts w:ascii="Times New Roman" w:hAnsi="Times New Roman"/>
+                <w:b w:val="0"/>
+                <w:i w:val="0"/>
+                <w:color w:val="000000"/>
+                <w:sz w:val="18"/>
+                <w:rFonts w:ascii="Times New Roman" w:hAnsi="Times New Roman"/>
+              </w:rPr>
+              <w:t>13.0</w:t>
+            </w:r>
+          </w:p>
+        </w:tc>
+        <w:tc>
+          <w:tcPr>
+            <w:tcW w:type="dxa" w:w="1418"/>
+          </w:tcPr>
+          <w:p>
+            <w:pPr>
+              <w:spacing w:before="40" w:after="40"/>
+              <w:jc w:val="center"/>
+            </w:pPr>
+            <w:r>
+              <w:rPr>
+                <w:rFonts w:ascii="Times New Roman" w:hAnsi="Times New Roman"/>
+                <w:b w:val="0"/>
+                <w:i w:val="0"/>
+                <w:color w:val="000000"/>
+                <w:sz w:val="18"/>
+                <w:rFonts w:ascii="Times New Roman" w:hAnsi="Times New Roman"/>
+              </w:rPr>
+              <w:t>11.0</w:t>
+            </w:r>
+          </w:p>
+        </w:tc>
+        <w:tc>
+          <w:tcPr>
+            <w:tcW w:type="dxa" w:w="1418"/>
+          </w:tcPr>
+          <w:p>
+            <w:pPr>
+              <w:spacing w:before="40" w:after="40"/>
+              <w:jc w:val="center"/>
+            </w:pPr>
+            <w:r>
+              <w:rPr>
+                <w:rFonts w:ascii="Times New Roman" w:hAnsi="Times New Roman"/>
+                <w:b w:val="0"/>
+                <w:i w:val="0"/>
+                <w:color w:val="000000"/>
+                <w:sz w:val="18"/>
+                <w:rFonts w:ascii="Times New Roman" w:hAnsi="Times New Roman"/>
+              </w:rPr>
+              <w:t>47.0</w:t>
+            </w:r>
+          </w:p>
+        </w:tc>
+        <w:tc>
+          <w:tcPr>
+            <w:tcW w:type="dxa" w:w="1418"/>
+          </w:tcPr>
+          <w:p>
+            <w:pPr>
+              <w:spacing w:before="40" w:after="40"/>
+              <w:jc w:val="center"/>
+            </w:pPr>
+            <w:r>
+              <w:rPr>
+                <w:rFonts w:ascii="Times New Roman" w:hAnsi="Times New Roman"/>
+                <w:b w:val="0"/>
+                <w:i w:val="0"/>
+                <w:color w:val="000000"/>
+                <w:sz w:val="18"/>
+                <w:rFonts w:ascii="Times New Roman" w:hAnsi="Times New Roman"/>
+              </w:rPr>
+              <w:t>34.0 ± 8.5</w:t>
+            </w:r>
+          </w:p>
+        </w:tc>
+        <w:tc>
+          <w:tcPr>
+            <w:tcW w:type="dxa" w:w="1418"/>
+          </w:tcPr>
+          <w:p>
+            <w:pPr>
+              <w:spacing w:before="40" w:after="40"/>
+              <w:jc w:val="center"/>
+            </w:pPr>
+            <w:r>
+              <w:rPr>
+                <w:rFonts w:ascii="Times New Roman" w:hAnsi="Times New Roman"/>
+                <w:b w:val="0"/>
+                <w:i w:val="0"/>
+                <w:color w:val="000000"/>
+                <w:sz w:val="18"/>
+                <w:rFonts w:ascii="Times New Roman" w:hAnsi="Times New Roman"/>
+              </w:rPr>
+              <w:t>36.4 ± 8.3</w:t>
+            </w:r>
+          </w:p>
+        </w:tc>
+        <w:tc>
+          <w:tcPr>
+            <w:tcW w:type="dxa" w:w="1418"/>
+          </w:tcPr>
+          <w:p>
+            <w:pPr>
+              <w:spacing w:before="40" w:after="40"/>
+              <w:jc w:val="center"/>
+            </w:pPr>
+            <w:r>
+              <w:rPr>
+                <w:rFonts w:ascii="Times New Roman" w:hAnsi="Times New Roman"/>
+                <w:b w:val="0"/>
+                <w:i w:val="0"/>
+                <w:color w:val="000000"/>
+                <w:sz w:val="18"/>
+                <w:rFonts w:ascii="Times New Roman" w:hAnsi="Times New Roman"/>
+              </w:rPr>
+              <w:t>161.7 ± 53.4</w:t>
+            </w:r>
+          </w:p>
+        </w:tc>
+      </w:tr>
+      <w:tr>
+        <w:tc>
+          <w:tcPr>
+            <w:tcW w:type="dxa" w:w="1418"/>
+          </w:tcPr>
+          <w:p>
+            <w:pPr>
+              <w:spacing w:before="40" w:after="40"/>
+              <w:jc w:val="left"/>
+            </w:pPr>
+            <w:r>
+              <w:rPr>
+                <w:rFonts w:ascii="Times New Roman" w:hAnsi="Times New Roman"/>
+                <w:b/>
+                <w:i w:val="0"/>
+                <w:color w:val="000000"/>
+                <w:sz w:val="18"/>
+                <w:rFonts w:ascii="Times New Roman" w:hAnsi="Times New Roman"/>
+              </w:rPr>
+              <w:t>GraN-DAG++</w:t>
+            </w:r>
+          </w:p>
+        </w:tc>
+        <w:tc>
+          <w:tcPr>
+            <w:tcW w:type="dxa" w:w="1418"/>
+          </w:tcPr>
+          <w:p>
+            <w:pPr>
+              <w:spacing w:before="40" w:after="40"/>
+              <w:jc w:val="center"/>
+            </w:pPr>
+            <w:r>
+              <w:rPr>
+                <w:rFonts w:ascii="Times New Roman" w:hAnsi="Times New Roman"/>
+                <w:b w:val="0"/>
+                <w:i w:val="0"/>
+                <w:color w:val="000000"/>
+                <w:sz w:val="18"/>
+                <w:rFonts w:ascii="Times New Roman" w:hAnsi="Times New Roman"/>
+              </w:rPr>
+              <w:t>13.0</w:t>
+            </w:r>
+          </w:p>
+        </w:tc>
+        <w:tc>
+          <w:tcPr>
+            <w:tcW w:type="dxa" w:w="1418"/>
+          </w:tcPr>
+          <w:p>
+            <w:pPr>
+              <w:spacing w:before="40" w:after="40"/>
+              <w:jc w:val="center"/>
+            </w:pPr>
+            <w:r>
+              <w:rPr>
+                <w:rFonts w:ascii="Times New Roman" w:hAnsi="Times New Roman"/>
+                <w:b w:val="0"/>
+                <w:i w:val="0"/>
+                <w:color w:val="000000"/>
+                <w:sz w:val="18"/>
+                <w:rFonts w:ascii="Times New Roman" w:hAnsi="Times New Roman"/>
+              </w:rPr>
+              <w:t>10.0</w:t>
+            </w:r>
+          </w:p>
+        </w:tc>
+        <w:tc>
+          <w:tcPr>
+            <w:tcW w:type="dxa" w:w="1418"/>
+          </w:tcPr>
+          <w:p>
+            <w:pPr>
+              <w:spacing w:before="40" w:after="40"/>
+              <w:jc w:val="center"/>
+            </w:pPr>
+            <w:r>
+              <w:rPr>
+                <w:rFonts w:ascii="Times New Roman" w:hAnsi="Times New Roman"/>
+                <w:b w:val="0"/>
+                <w:i w:val="0"/>
+                <w:color w:val="000000"/>
+                <w:sz w:val="18"/>
+                <w:rFonts w:ascii="Times New Roman" w:hAnsi="Times New Roman"/>
+              </w:rPr>
+              <w:t>48.0</w:t>
+            </w:r>
+          </w:p>
+        </w:tc>
+        <w:tc>
+          <w:tcPr>
+            <w:tcW w:type="dxa" w:w="1418"/>
+          </w:tcPr>
+          <w:p>
+            <w:pPr>
+              <w:spacing w:before="40" w:after="40"/>
+              <w:jc w:val="center"/>
+            </w:pPr>
+            <w:r>
+              <w:rPr>
+                <w:rFonts w:ascii="Times New Roman" w:hAnsi="Times New Roman"/>
+                <w:b w:val="0"/>
+                <w:i w:val="0"/>
+                <w:color w:val="000000"/>
+                <w:sz w:val="18"/>
+                <w:rFonts w:ascii="Times New Roman" w:hAnsi="Times New Roman"/>
+              </w:rPr>
+              <w:t>33.7 ± 3.7</w:t>
+            </w:r>
+          </w:p>
+        </w:tc>
+        <w:tc>
+          <w:tcPr>
+            <w:tcW w:type="dxa" w:w="1418"/>
+          </w:tcPr>
+          <w:p>
+            <w:pPr>
+              <w:spacing w:before="40" w:after="40"/>
+              <w:jc w:val="center"/>
+            </w:pPr>
+            <w:r>
+              <w:rPr>
+                <w:rFonts w:ascii="Times New Roman" w:hAnsi="Times New Roman"/>
+                <w:b w:val="0"/>
+                <w:i w:val="0"/>
+                <w:color w:val="000000"/>
+                <w:sz w:val="18"/>
+                <w:rFonts w:ascii="Times New Roman" w:hAnsi="Times New Roman"/>
+              </w:rPr>
+              <w:t>39.4 ± 4.9</w:t>
+            </w:r>
+          </w:p>
+        </w:tc>
+        <w:tc>
+          <w:tcPr>
+            <w:tcW w:type="dxa" w:w="1418"/>
+          </w:tcPr>
+          <w:p>
+            <w:pPr>
+              <w:spacing w:before="40" w:after="40"/>
+              <w:jc w:val="center"/>
+            </w:pPr>
+            <w:r>
+              <w:rPr>
+                <w:rFonts w:ascii="Times New Roman" w:hAnsi="Times New Roman"/>
+                <w:b w:val="0"/>
+                <w:i w:val="0"/>
+                <w:color w:val="000000"/>
+                <w:sz w:val="18"/>
+                <w:rFonts w:ascii="Times New Roman" w:hAnsi="Times New Roman"/>
+              </w:rPr>
+              <w:t>127.5 ± 52.8</w:t>
+            </w:r>
+          </w:p>
+        </w:tc>
+      </w:tr>
+      <w:tr>
+        <w:tc>
+          <w:tcPr>
+            <w:tcW w:type="dxa" w:w="1418"/>
+          </w:tcPr>
+          <w:p>
+            <w:pPr>
+              <w:spacing w:before="40" w:after="40"/>
+              <w:jc w:val="left"/>
+            </w:pPr>
+            <w:r>
+              <w:rPr>
+                <w:rFonts w:ascii="Times New Roman" w:hAnsi="Times New Roman"/>
+                <w:b/>
+                <w:i w:val="0"/>
+                <w:color w:val="000000"/>
+                <w:sz w:val="18"/>
+                <w:rFonts w:ascii="Times New Roman" w:hAnsi="Times New Roman"/>
+              </w:rPr>
+              <w:t>DAG-GNN</w:t>
+            </w:r>
+          </w:p>
+        </w:tc>
+        <w:tc>
+          <w:tcPr>
+            <w:tcW w:type="dxa" w:w="1418"/>
+          </w:tcPr>
+          <w:p>
+            <w:pPr>
+              <w:spacing w:before="40" w:after="40"/>
+              <w:jc w:val="center"/>
+            </w:pPr>
+            <w:r>
+              <w:rPr>
+                <w:rFonts w:ascii="Times New Roman" w:hAnsi="Times New Roman"/>
+                <w:b w:val="0"/>
+                <w:i w:val="0"/>
+                <w:color w:val="000000"/>
+                <w:sz w:val="18"/>
+                <w:rFonts w:ascii="Times New Roman" w:hAnsi="Times New Roman"/>
+              </w:rPr>
+              <w:t>16.0</w:t>
+            </w:r>
+          </w:p>
+        </w:tc>
+        <w:tc>
+          <w:tcPr>
+            <w:tcW w:type="dxa" w:w="1418"/>
+          </w:tcPr>
+          <w:p>
+            <w:pPr>
+              <w:spacing w:before="40" w:after="40"/>
+              <w:jc w:val="center"/>
+            </w:pPr>
+            <w:r>
+              <w:rPr>
+                <w:rFonts w:ascii="Times New Roman" w:hAnsi="Times New Roman"/>
+                <w:b w:val="0"/>
+                <w:i w:val="0"/>
+                <w:color w:val="000000"/>
+                <w:sz w:val="18"/>
+                <w:rFonts w:ascii="Times New Roman" w:hAnsi="Times New Roman"/>
+              </w:rPr>
+              <w:t>21.0</w:t>
+            </w:r>
+          </w:p>
+        </w:tc>
+        <w:tc>
+          <w:tcPr>
+            <w:tcW w:type="dxa" w:w="1418"/>
+          </w:tcPr>
+          <w:p>
+            <w:pPr>
+              <w:spacing w:before="40" w:after="40"/>
+              <w:jc w:val="center"/>
+            </w:pPr>
+            <w:r>
+              <w:rPr>
+                <w:rFonts w:ascii="Times New Roman" w:hAnsi="Times New Roman"/>
+                <w:b w:val="0"/>
+                <w:i w:val="0"/>
+                <w:color w:val="000000"/>
+                <w:sz w:val="18"/>
+                <w:rFonts w:ascii="Times New Roman" w:hAnsi="Times New Roman"/>
+              </w:rPr>
+              <w:t>44.0</w:t>
+            </w:r>
+          </w:p>
+        </w:tc>
+        <w:tc>
+          <w:tcPr>
+            <w:tcW w:type="dxa" w:w="1418"/>
+          </w:tcPr>
+          <w:p>
+            <w:pPr>
+              <w:spacing w:before="40" w:after="40"/>
+              <w:jc w:val="center"/>
+            </w:pPr>
+            <w:r>
+              <w:rPr>
+                <w:rFonts w:ascii="Times New Roman" w:hAnsi="Times New Roman"/>
+                <w:b w:val="0"/>
+                <w:i w:val="0"/>
+                <w:color w:val="000000"/>
+                <w:sz w:val="18"/>
+                <w:rFonts w:ascii="Times New Roman" w:hAnsi="Times New Roman"/>
+              </w:rPr>
+              <w:t>93.6 ± 9.2</w:t>
+            </w:r>
+          </w:p>
+        </w:tc>
+        <w:tc>
+          <w:tcPr>
+            <w:tcW w:type="dxa" w:w="1418"/>
+          </w:tcPr>
+          <w:p>
+            <w:pPr>
+              <w:spacing w:before="40" w:after="40"/>
+              <w:jc w:val="center"/>
+            </w:pPr>
+            <w:r>
+              <w:rPr>
+                <w:rFonts w:ascii="Times New Roman" w:hAnsi="Times New Roman"/>
+                <w:b w:val="0"/>
+                <w:i w:val="0"/>
+                <w:color w:val="000000"/>
+                <w:sz w:val="18"/>
+                <w:rFonts w:ascii="Times New Roman" w:hAnsi="Times New Roman"/>
+              </w:rPr>
+              <w:t>97.6 ± 10.3</w:t>
+            </w:r>
+          </w:p>
+        </w:tc>
+        <w:tc>
+          <w:tcPr>
+            <w:tcW w:type="dxa" w:w="1418"/>
+          </w:tcPr>
+          <w:p>
+            <w:pPr>
+              <w:spacing w:before="40" w:after="40"/>
+              <w:jc w:val="center"/>
+            </w:pPr>
+            <w:r>
+              <w:rPr>
+                <w:rFonts w:ascii="Times New Roman" w:hAnsi="Times New Roman"/>
+                <w:b w:val="0"/>
+                <w:i w:val="0"/>
+                <w:color w:val="000000"/>
+                <w:sz w:val="18"/>
+                <w:rFonts w:ascii="Times New Roman" w:hAnsi="Times New Roman"/>
+              </w:rPr>
+              <w:t>157.5 ± 74.6</w:t>
+            </w:r>
+          </w:p>
+        </w:tc>
+      </w:tr>
+      <w:tr>
+        <w:tc>
+          <w:tcPr>
+            <w:tcW w:type="dxa" w:w="1418"/>
+          </w:tcPr>
+          <w:p>
+            <w:pPr>
+              <w:spacing w:before="40" w:after="40"/>
+              <w:jc w:val="left"/>
+            </w:pPr>
+            <w:r>
+              <w:rPr>
+                <w:rFonts w:ascii="Times New Roman" w:hAnsi="Times New Roman"/>
+                <w:b/>
+                <w:i w:val="0"/>
+                <w:color w:val="000000"/>
+                <w:sz w:val="18"/>
+                <w:rFonts w:ascii="Times New Roman" w:hAnsi="Times New Roman"/>
+              </w:rPr>
+              <w:t>NOTEARS</w:t>
+            </w:r>
+          </w:p>
+        </w:tc>
+        <w:tc>
+          <w:tcPr>
+            <w:tcW w:type="dxa" w:w="1418"/>
+          </w:tcPr>
+          <w:p>
+            <w:pPr>
+              <w:spacing w:before="40" w:after="40"/>
+              <w:jc w:val="center"/>
+            </w:pPr>
+            <w:r>
+              <w:rPr>
+                <w:rFonts w:ascii="Times New Roman" w:hAnsi="Times New Roman"/>
+                <w:b w:val="0"/>
+                <w:i w:val="0"/>
+                <w:color w:val="000000"/>
+                <w:sz w:val="18"/>
+                <w:rFonts w:ascii="Times New Roman" w:hAnsi="Times New Roman"/>
+              </w:rPr>
+              <w:t>21.0</w:t>
+            </w:r>
+          </w:p>
+        </w:tc>
+        <w:tc>
+          <w:tcPr>
+            <w:tcW w:type="dxa" w:w="1418"/>
+          </w:tcPr>
+          <w:p>
+            <w:pPr>
+              <w:spacing w:before="40" w:after="40"/>
+              <w:jc w:val="center"/>
+            </w:pPr>
+            <w:r>
+              <w:rPr>
+                <w:rFonts w:ascii="Times New Roman" w:hAnsi="Times New Roman"/>
+                <w:b w:val="0"/>
+                <w:i w:val="0"/>
+                <w:color w:val="000000"/>
+                <w:sz w:val="18"/>
+                <w:rFonts w:ascii="Times New Roman" w:hAnsi="Times New Roman"/>
+              </w:rPr>
+              <w:t>21.0</w:t>
+            </w:r>
+          </w:p>
+        </w:tc>
+        <w:tc>
+          <w:tcPr>
+            <w:tcW w:type="dxa" w:w="1418"/>
+          </w:tcPr>
+          <w:p>
+            <w:pPr>
+              <w:spacing w:before="40" w:after="40"/>
+              <w:jc w:val="center"/>
+            </w:pPr>
+            <w:r>
+              <w:rPr>
+                <w:rFonts w:ascii="Times New Roman" w:hAnsi="Times New Roman"/>
+                <w:b w:val="0"/>
+                <w:i w:val="0"/>
+                <w:color w:val="000000"/>
+                <w:sz w:val="18"/>
+                <w:rFonts w:ascii="Times New Roman" w:hAnsi="Times New Roman"/>
+              </w:rPr>
+              <w:t>44.0</w:t>
+            </w:r>
+          </w:p>
+        </w:tc>
+        <w:tc>
+          <w:tcPr>
+            <w:tcW w:type="dxa" w:w="1418"/>
+          </w:tcPr>
+          <w:p>
+            <w:pPr>
+              <w:spacing w:before="40" w:after="40"/>
+              <w:jc w:val="center"/>
+            </w:pPr>
+            <w:r>
+              <w:rPr>
+                <w:rFonts w:ascii="Times New Roman" w:hAnsi="Times New Roman"/>
+                <w:b w:val="0"/>
+                <w:i w:val="0"/>
+                <w:color w:val="000000"/>
+                <w:sz w:val="18"/>
+                <w:rFonts w:ascii="Times New Roman" w:hAnsi="Times New Roman"/>
+              </w:rPr>
+              <w:t>151.8 ± 28.2</w:t>
+            </w:r>
+          </w:p>
+        </w:tc>
+        <w:tc>
+          <w:tcPr>
+            <w:tcW w:type="dxa" w:w="1418"/>
+          </w:tcPr>
+          <w:p>
+            <w:pPr>
+              <w:spacing w:before="40" w:after="40"/>
+              <w:jc w:val="center"/>
+            </w:pPr>
+            <w:r>
+              <w:rPr>
+                <w:rFonts w:ascii="Times New Roman" w:hAnsi="Times New Roman"/>
+                <w:b w:val="0"/>
+                <w:i w:val="0"/>
+                <w:color w:val="000000"/>
+                <w:sz w:val="18"/>
+                <w:rFonts w:ascii="Times New Roman" w:hAnsi="Times New Roman"/>
+              </w:rPr>
+              <w:t>156.1 ± 28.7</w:t>
+            </w:r>
+          </w:p>
+        </w:tc>
+        <w:tc>
+          <w:tcPr>
+            <w:tcW w:type="dxa" w:w="1418"/>
+          </w:tcPr>
+          <w:p>
+            <w:pPr>
+              <w:spacing w:before="40" w:after="40"/>
+              <w:jc w:val="center"/>
+            </w:pPr>
+            <w:r>
+              <w:rPr>
+                <w:rFonts w:ascii="Times New Roman" w:hAnsi="Times New Roman"/>
+                <w:b w:val="0"/>
+                <w:i w:val="0"/>
+                <w:color w:val="000000"/>
+                <w:sz w:val="18"/>
+                <w:rFonts w:ascii="Times New Roman" w:hAnsi="Times New Roman"/>
+              </w:rPr>
+              <w:t>110.7 ± 66.7</w:t>
+            </w:r>
+          </w:p>
+        </w:tc>
+      </w:tr>
+      <w:tr>
+        <w:tc>
+          <w:tcPr>
+            <w:tcW w:type="dxa" w:w="1418"/>
+          </w:tcPr>
+          <w:p>
+            <w:pPr>
+              <w:spacing w:before="40" w:after="40"/>
+              <w:jc w:val="left"/>
+            </w:pPr>
+            <w:r>
+              <w:rPr>
+                <w:rFonts w:ascii="Times New Roman" w:hAnsi="Times New Roman"/>
+                <w:b/>
+                <w:i w:val="0"/>
+                <w:color w:val="000000"/>
+                <w:sz w:val="18"/>
+                <w:rFonts w:ascii="Times New Roman" w:hAnsi="Times New Roman"/>
+              </w:rPr>
+              <w:t>CAM</w:t>
+            </w:r>
+          </w:p>
+        </w:tc>
+        <w:tc>
+          <w:tcPr>
+            <w:tcW w:type="dxa" w:w="1418"/>
+          </w:tcPr>
+          <w:p>
+            <w:pPr>
+              <w:spacing w:before="40" w:after="40"/>
+              <w:jc w:val="center"/>
+            </w:pPr>
+            <w:r>
+              <w:rPr>
+                <w:rFonts w:ascii="Times New Roman" w:hAnsi="Times New Roman"/>
+                <w:b w:val="0"/>
+                <w:i w:val="0"/>
+                <w:color w:val="000000"/>
+                <w:sz w:val="18"/>
+                <w:rFonts w:ascii="Times New Roman" w:hAnsi="Times New Roman"/>
+              </w:rPr>
+              <w:t>12.0</w:t>
+            </w:r>
+          </w:p>
+        </w:tc>
+        <w:tc>
+          <w:tcPr>
+            <w:tcW w:type="dxa" w:w="1418"/>
+          </w:tcPr>
+          <w:p>
+            <w:pPr>
+              <w:spacing w:before="40" w:after="40"/>
+              <w:jc w:val="center"/>
+            </w:pPr>
+            <w:r>
+              <w:rPr>
+                <w:rFonts w:ascii="Times New Roman" w:hAnsi="Times New Roman"/>
+                <w:b w:val="0"/>
+                <w:i w:val="0"/>
+                <w:color w:val="000000"/>
+                <w:sz w:val="18"/>
+                <w:rFonts w:ascii="Times New Roman" w:hAnsi="Times New Roman"/>
+              </w:rPr>
+              <w:t>9.0</w:t>
+            </w:r>
+          </w:p>
+        </w:tc>
+        <w:tc>
+          <w:tcPr>
+            <w:tcW w:type="dxa" w:w="1418"/>
+          </w:tcPr>
+          <w:p>
+            <w:pPr>
+              <w:spacing w:before="40" w:after="40"/>
+              <w:jc w:val="center"/>
+            </w:pPr>
+            <w:r>
+              <w:rPr>
+                <w:rFonts w:ascii="Times New Roman" w:hAnsi="Times New Roman"/>
+                <w:b w:val="0"/>
+                <w:i w:val="0"/>
+                <w:color w:val="000000"/>
+                <w:sz w:val="18"/>
+                <w:rFonts w:ascii="Times New Roman" w:hAnsi="Times New Roman"/>
+              </w:rPr>
+              <w:t>55.0</w:t>
+            </w:r>
+          </w:p>
+        </w:tc>
+        <w:tc>
+          <w:tcPr>
+            <w:tcW w:type="dxa" w:w="1418"/>
+          </w:tcPr>
+          <w:p>
+            <w:pPr>
+              <w:spacing w:before="40" w:after="40"/>
+              <w:jc w:val="center"/>
+            </w:pPr>
+            <w:r>
+              <w:rPr>
+                <w:rFonts w:ascii="Times New Roman" w:hAnsi="Times New Roman"/>
+                <w:b w:val="0"/>
+                <w:i w:val="0"/>
+                <w:color w:val="000000"/>
+                <w:sz w:val="18"/>
+                <w:rFonts w:ascii="Times New Roman" w:hAnsi="Times New Roman"/>
+              </w:rPr>
+              <w:t>40.5 ± 6.8</w:t>
+            </w:r>
+          </w:p>
+        </w:tc>
+        <w:tc>
+          <w:tcPr>
+            <w:tcW w:type="dxa" w:w="1418"/>
+          </w:tcPr>
+          <w:p>
+            <w:pPr>
+              <w:spacing w:before="40" w:after="40"/>
+              <w:jc w:val="center"/>
+            </w:pPr>
+            <w:r>
+              <w:rPr>
+                <w:rFonts w:ascii="Times New Roman" w:hAnsi="Times New Roman"/>
+                <w:b w:val="0"/>
+                <w:i w:val="0"/>
+                <w:color w:val="000000"/>
+                <w:sz w:val="18"/>
+                <w:rFonts w:ascii="Times New Roman" w:hAnsi="Times New Roman"/>
+              </w:rPr>
+              <w:t>41.4 ± 7.1</w:t>
+            </w:r>
+          </w:p>
+        </w:tc>
+        <w:tc>
+          <w:tcPr>
+            <w:tcW w:type="dxa" w:w="1418"/>
+          </w:tcPr>
+          <w:p>
+            <w:pPr>
+              <w:spacing w:before="40" w:after="40"/>
+              <w:jc w:val="center"/>
+            </w:pPr>
+            <w:r>
+              <w:rPr>
+                <w:rFonts w:ascii="Times New Roman" w:hAnsi="Times New Roman"/>
+                <w:b w:val="0"/>
+                <w:i w:val="0"/>
+                <w:color w:val="000000"/>
+                <w:sz w:val="18"/>
+                <w:rFonts w:ascii="Times New Roman" w:hAnsi="Times New Roman"/>
+              </w:rPr>
+              <w:t>152.3 ± 48.0</w:t>
+            </w:r>
+          </w:p>
+        </w:tc>
+      </w:tr>
+      <w:tr>
+        <w:tc>
+          <w:tcPr>
+            <w:tcW w:type="dxa" w:w="1418"/>
+          </w:tcPr>
+          <w:p>
+            <w:pPr>
+              <w:spacing w:before="40" w:after="40"/>
+              <w:jc w:val="left"/>
+            </w:pPr>
+            <w:r>
+              <w:rPr>
+                <w:rFonts w:ascii="Times New Roman" w:hAnsi="Times New Roman"/>
+                <w:b/>
+                <w:i w:val="0"/>
+                <w:color w:val="000000"/>
+                <w:sz w:val="18"/>
+                <w:rFonts w:ascii="Times New Roman" w:hAnsi="Times New Roman"/>
+              </w:rPr>
+              <w:t>GSF</w:t>
+            </w:r>
+          </w:p>
+        </w:tc>
+        <w:tc>
+          <w:tcPr>
+            <w:tcW w:type="dxa" w:w="1418"/>
+          </w:tcPr>
+          <w:p>
+            <w:pPr>
+              <w:spacing w:before="40" w:after="40"/>
+              <w:jc w:val="center"/>
+            </w:pPr>
+            <w:r>
+              <w:rPr>
+                <w:rFonts w:ascii="Times New Roman" w:hAnsi="Times New Roman"/>
+                <w:b w:val="0"/>
+                <w:i w:val="0"/>
+                <w:color w:val="000000"/>
+                <w:sz w:val="18"/>
+                <w:rFonts w:ascii="Times New Roman" w:hAnsi="Times New Roman"/>
+              </w:rPr>
+              <w:t>18.0</w:t>
+            </w:r>
+          </w:p>
+        </w:tc>
+        <w:tc>
+          <w:tcPr>
+            <w:tcW w:type="dxa" w:w="1418"/>
+          </w:tcPr>
+          <w:p>
+            <w:pPr>
+              <w:spacing w:before="40" w:after="40"/>
+              <w:jc w:val="center"/>
+            </w:pPr>
+            <w:r>
+              <w:rPr>
+                <w:rFonts w:ascii="Times New Roman" w:hAnsi="Times New Roman"/>
+                <w:b w:val="0"/>
+                <w:i w:val="0"/>
+                <w:color w:val="000000"/>
+                <w:sz w:val="18"/>
+                <w:rFonts w:ascii="Times New Roman" w:hAnsi="Times New Roman"/>
+              </w:rPr>
+              <w:t>10.0</w:t>
+            </w:r>
+          </w:p>
+        </w:tc>
+        <w:tc>
+          <w:tcPr>
+            <w:tcW w:type="dxa" w:w="1418"/>
+          </w:tcPr>
+          <w:p>
+            <w:pPr>
+              <w:spacing w:before="40" w:after="40"/>
+              <w:jc w:val="center"/>
+            </w:pPr>
+            <w:r>
+              <w:rPr>
+                <w:rFonts w:ascii="Times New Roman" w:hAnsi="Times New Roman"/>
+                <w:b w:val="0"/>
+                <w:i w:val="0"/>
+                <w:color w:val="000000"/>
+                <w:sz w:val="18"/>
+                <w:rFonts w:ascii="Times New Roman" w:hAnsi="Times New Roman"/>
+              </w:rPr>
+              <w:t>44-61</w:t>
+            </w:r>
+          </w:p>
+        </w:tc>
+        <w:tc>
+          <w:tcPr>
+            <w:tcW w:type="dxa" w:w="1418"/>
+          </w:tcPr>
+          <w:p>
+            <w:pPr>
+              <w:spacing w:before="40" w:after="40"/>
+              <w:jc w:val="center"/>
+            </w:pPr>
+            <w:r>
+              <w:rPr>
+                <w:rFonts w:ascii="Times New Roman" w:hAnsi="Times New Roman"/>
+                <w:b w:val="0"/>
+                <w:i w:val="0"/>
+                <w:color w:val="000000"/>
+                <w:sz w:val="18"/>
+                <w:rFonts w:ascii="Times New Roman" w:hAnsi="Times New Roman"/>
+              </w:rPr>
+              <w:t>61.8 ± 9.6</w:t>
+            </w:r>
+          </w:p>
+        </w:tc>
+        <w:tc>
+          <w:tcPr>
+            <w:tcW w:type="dxa" w:w="1418"/>
+          </w:tcPr>
+          <w:p>
+            <w:pPr>
+              <w:spacing w:before="40" w:after="40"/>
+              <w:jc w:val="center"/>
+            </w:pPr>
+            <w:r>
+              <w:rPr>
+                <w:rFonts w:ascii="Times New Roman" w:hAnsi="Times New Roman"/>
+                <w:b w:val="0"/>
+                <w:i w:val="0"/>
+                <w:color w:val="000000"/>
+                <w:sz w:val="18"/>
+                <w:rFonts w:ascii="Times New Roman" w:hAnsi="Times New Roman"/>
+              </w:rPr>
+              <w:t>63.3 ± 11.4</w:t>
+            </w:r>
+          </w:p>
+        </w:tc>
+        <w:tc>
+          <w:tcPr>
+            <w:tcW w:type="dxa" w:w="1418"/>
+          </w:tcPr>
+          <w:p>
+            <w:pPr>
+              <w:spacing w:before="40" w:after="40"/>
+              <w:jc w:val="center"/>
+            </w:pPr>
+            <w:r>
+              <w:rPr>
+                <w:rFonts w:ascii="Times New Roman" w:hAnsi="Times New Roman"/>
+                <w:b w:val="0"/>
+                <w:i w:val="0"/>
+                <w:color w:val="000000"/>
+                <w:sz w:val="18"/>
+                <w:rFonts w:ascii="Times New Roman" w:hAnsi="Times New Roman"/>
+              </w:rPr>
+              <w:t>76.7 ± 51.1</w:t>
+            </w:r>
+          </w:p>
+        </w:tc>
+      </w:tr>
+      <w:tr>
+        <w:tc>
+          <w:tcPr>
+            <w:tcW w:type="dxa" w:w="1418"/>
+          </w:tcPr>
+          <w:p>
+            <w:pPr>
+              <w:spacing w:before="40" w:after="40"/>
+              <w:jc w:val="left"/>
+            </w:pPr>
+            <w:r>
+              <w:rPr>
+                <w:rFonts w:ascii="Times New Roman" w:hAnsi="Times New Roman"/>
+                <w:b/>
+                <w:i w:val="0"/>
+                <w:color w:val="000000"/>
+                <w:sz w:val="18"/>
+                <w:rFonts w:ascii="Times New Roman" w:hAnsi="Times New Roman"/>
+              </w:rPr>
+              <w:t>GES</w:t>
+            </w:r>
+          </w:p>
+        </w:tc>
+        <w:tc>
+          <w:tcPr>
+            <w:tcW w:type="dxa" w:w="1418"/>
+          </w:tcPr>
+          <w:p>
+            <w:pPr>
+              <w:spacing w:before="40" w:after="40"/>
+              <w:jc w:val="center"/>
+            </w:pPr>
+            <w:r>
+              <w:rPr>
+                <w:rFonts w:ascii="Times New Roman" w:hAnsi="Times New Roman"/>
+                <w:b w:val="0"/>
+                <w:i w:val="0"/>
+                <w:color w:val="000000"/>
+                <w:sz w:val="18"/>
+                <w:rFonts w:ascii="Times New Roman" w:hAnsi="Times New Roman"/>
+              </w:rPr>
+              <w:t>26.0</w:t>
+            </w:r>
+          </w:p>
+        </w:tc>
+        <w:tc>
+          <w:tcPr>
+            <w:tcW w:type="dxa" w:w="1418"/>
+          </w:tcPr>
+          <w:p>
+            <w:pPr>
+              <w:spacing w:before="40" w:after="40"/>
+              <w:jc w:val="center"/>
+            </w:pPr>
+            <w:r>
+              <w:rPr>
+                <w:rFonts w:ascii="Times New Roman" w:hAnsi="Times New Roman"/>
+                <w:b w:val="0"/>
+                <w:i w:val="0"/>
+                <w:color w:val="000000"/>
+                <w:sz w:val="18"/>
+                <w:rFonts w:ascii="Times New Roman" w:hAnsi="Times New Roman"/>
+              </w:rPr>
+              <w:t>28.0</w:t>
+            </w:r>
+          </w:p>
+        </w:tc>
+        <w:tc>
+          <w:tcPr>
+            <w:tcW w:type="dxa" w:w="1418"/>
+          </w:tcPr>
+          <w:p>
+            <w:pPr>
+              <w:spacing w:before="40" w:after="40"/>
+              <w:jc w:val="center"/>
+            </w:pPr>
+            <w:r>
+              <w:rPr>
+                <w:rFonts w:ascii="Times New Roman" w:hAnsi="Times New Roman"/>
+                <w:b w:val="0"/>
+                <w:i w:val="0"/>
+                <w:color w:val="000000"/>
+                <w:sz w:val="18"/>
+                <w:rFonts w:ascii="Times New Roman" w:hAnsi="Times New Roman"/>
+              </w:rPr>
+              <w:t>34-45</w:t>
+            </w:r>
+          </w:p>
+        </w:tc>
+        <w:tc>
+          <w:tcPr>
+            <w:tcW w:type="dxa" w:w="1418"/>
+          </w:tcPr>
+          <w:p>
+            <w:pPr>
+              <w:spacing w:before="40" w:after="40"/>
+              <w:jc w:val="center"/>
+            </w:pPr>
+            <w:r>
+              <w:rPr>
+                <w:rFonts w:ascii="Times New Roman" w:hAnsi="Times New Roman"/>
+                <w:b w:val="0"/>
+                <w:i w:val="0"/>
+                <w:color w:val="000000"/>
+                <w:sz w:val="18"/>
+                <w:rFonts w:ascii="Times New Roman" w:hAnsi="Times New Roman"/>
+              </w:rPr>
+              <w:t>82.6 ± 9.3</w:t>
+            </w:r>
+          </w:p>
+        </w:tc>
+        <w:tc>
+          <w:tcPr>
+            <w:tcW w:type="dxa" w:w="1418"/>
+          </w:tcPr>
+          <w:p>
+            <w:pPr>
+              <w:spacing w:before="40" w:after="40"/>
+              <w:jc w:val="center"/>
+            </w:pPr>
+            <w:r>
+              <w:rPr>
+                <w:rFonts w:ascii="Times New Roman" w:hAnsi="Times New Roman"/>
+                <w:b w:val="0"/>
+                <w:i w:val="0"/>
+                <w:color w:val="000000"/>
+                <w:sz w:val="18"/>
+                <w:rFonts w:ascii="Times New Roman" w:hAnsi="Times New Roman"/>
+              </w:rPr>
+              <w:t>85.6 ± 10.0</w:t>
+            </w:r>
+          </w:p>
+        </w:tc>
+        <w:tc>
+          <w:tcPr>
+            <w:tcW w:type="dxa" w:w="1418"/>
+          </w:tcPr>
+          <w:p>
+            <w:pPr>
+              <w:spacing w:before="40" w:after="40"/>
+              <w:jc w:val="center"/>
+            </w:pPr>
+            <w:r>
+              <w:rPr>
+                <w:rFonts w:ascii="Times New Roman" w:hAnsi="Times New Roman"/>
+                <w:b w:val="0"/>
+                <w:i w:val="0"/>
+                <w:color w:val="000000"/>
+                <w:sz w:val="18"/>
+                <w:rFonts w:ascii="Times New Roman" w:hAnsi="Times New Roman"/>
+              </w:rPr>
+              <w:t>157.2 ± 48.3</w:t>
+            </w:r>
+          </w:p>
+        </w:tc>
+      </w:tr>
+      <w:tr>
+        <w:tc>
+          <w:tcPr>
+            <w:tcW w:type="dxa" w:w="1418"/>
+          </w:tcPr>
+          <w:p>
+            <w:pPr>
+              <w:spacing w:before="40" w:after="40"/>
+              <w:jc w:val="left"/>
+            </w:pPr>
+            <w:r>
+              <w:rPr>
+                <w:rFonts w:ascii="Times New Roman" w:hAnsi="Times New Roman"/>
+                <w:b/>
+                <w:i w:val="0"/>
+                <w:color w:val="000000"/>
+                <w:sz w:val="18"/>
+                <w:rFonts w:ascii="Times New Roman" w:hAnsi="Times New Roman"/>
+              </w:rPr>
+              <w:t>PC</w:t>
+            </w:r>
+          </w:p>
+        </w:tc>
+        <w:tc>
+          <w:tcPr>
+            <w:tcW w:type="dxa" w:w="1418"/>
+          </w:tcPr>
+          <w:p>
+            <w:pPr>
+              <w:spacing w:before="40" w:after="40"/>
+              <w:jc w:val="center"/>
+            </w:pPr>
+            <w:r>
+              <w:rPr>
+                <w:rFonts w:ascii="Times New Roman" w:hAnsi="Times New Roman"/>
+                <w:b w:val="0"/>
+                <w:i w:val="0"/>
+                <w:color w:val="000000"/>
+                <w:sz w:val="18"/>
+                <w:rFonts w:ascii="Times New Roman" w:hAnsi="Times New Roman"/>
+              </w:rPr>
+              <w:t>17.0</w:t>
+            </w:r>
+          </w:p>
+        </w:tc>
+        <w:tc>
+          <w:tcPr>
+            <w:tcW w:type="dxa" w:w="1418"/>
+          </w:tcPr>
+          <w:p>
+            <w:pPr>
+              <w:spacing w:before="40" w:after="40"/>
+              <w:jc w:val="center"/>
+            </w:pPr>
+            <w:r>
+              <w:rPr>
+                <w:rFonts w:ascii="Times New Roman" w:hAnsi="Times New Roman"/>
+                <w:b w:val="0"/>
+                <w:i w:val="0"/>
+                <w:color w:val="000000"/>
+                <w:sz w:val="18"/>
+                <w:rFonts w:ascii="Times New Roman" w:hAnsi="Times New Roman"/>
+              </w:rPr>
+              <w:t>11.0</w:t>
+            </w:r>
+          </w:p>
+        </w:tc>
+        <w:tc>
+          <w:tcPr>
+            <w:tcW w:type="dxa" w:w="1418"/>
+          </w:tcPr>
+          <w:p>
+            <w:pPr>
+              <w:spacing w:before="40" w:after="40"/>
+              <w:jc w:val="center"/>
+            </w:pPr>
+            <w:r>
+              <w:rPr>
+                <w:rFonts w:ascii="Times New Roman" w:hAnsi="Times New Roman"/>
+                <w:b w:val="0"/>
+                <w:i w:val="0"/>
+                <w:color w:val="000000"/>
+                <w:sz w:val="18"/>
+                <w:rFonts w:ascii="Times New Roman" w:hAnsi="Times New Roman"/>
+              </w:rPr>
+              <w:t>47-62</w:t>
+            </w:r>
+          </w:p>
+        </w:tc>
+        <w:tc>
+          <w:tcPr>
+            <w:tcW w:type="dxa" w:w="1418"/>
+          </w:tcPr>
+          <w:p>
+            <w:pPr>
+              <w:spacing w:before="40" w:after="40"/>
+              <w:jc w:val="center"/>
+            </w:pPr>
+            <w:r>
+              <w:rPr>
+                <w:rFonts w:ascii="Times New Roman" w:hAnsi="Times New Roman"/>
+                <w:b w:val="0"/>
+                <w:i w:val="0"/>
+                <w:color w:val="000000"/>
+                <w:sz w:val="18"/>
+                <w:rFonts w:ascii="Times New Roman" w:hAnsi="Times New Roman"/>
+              </w:rPr>
+              <w:t>41.0 ± 5.1</w:t>
+            </w:r>
+          </w:p>
+        </w:tc>
+        <w:tc>
+          <w:tcPr>
+            <w:tcW w:type="dxa" w:w="1418"/>
+          </w:tcPr>
+          <w:p>
+            <w:pPr>
+              <w:spacing w:before="40" w:after="40"/>
+              <w:jc w:val="center"/>
+            </w:pPr>
+            <w:r>
+              <w:rPr>
+                <w:rFonts w:ascii="Times New Roman" w:hAnsi="Times New Roman"/>
+                <w:b w:val="0"/>
+                <w:i w:val="0"/>
+                <w:color w:val="000000"/>
+                <w:sz w:val="18"/>
+                <w:rFonts w:ascii="Times New Roman" w:hAnsi="Times New Roman"/>
+              </w:rPr>
+              <w:t>42.4 ± 4.6</w:t>
+            </w:r>
+          </w:p>
+        </w:tc>
+        <w:tc>
+          <w:tcPr>
+            <w:tcW w:type="dxa" w:w="1418"/>
+          </w:tcPr>
+          <w:p>
+            <w:pPr>
+              <w:spacing w:before="40" w:after="40"/>
+              <w:jc w:val="center"/>
+            </w:pPr>
+            <w:r>
+              <w:rPr>
+                <w:rFonts w:ascii="Times New Roman" w:hAnsi="Times New Roman"/>
+                <w:b w:val="0"/>
+                <w:i w:val="0"/>
+                <w:color w:val="000000"/>
+                <w:sz w:val="18"/>
+                <w:rFonts w:ascii="Times New Roman" w:hAnsi="Times New Roman"/>
+              </w:rPr>
+              <w:t>154.8 ± 47.6</w:t>
+            </w:r>
+          </w:p>
+        </w:tc>
+      </w:tr>
+      <w:tr>
+        <w:tc>
+          <w:tcPr>
+            <w:tcW w:type="dxa" w:w="1418"/>
+          </w:tcPr>
+          <w:p>
+            <w:pPr>
+              <w:spacing w:before="40" w:after="40"/>
+              <w:jc w:val="left"/>
+            </w:pPr>
+            <w:r>
+              <w:rPr>
+                <w:rFonts w:ascii="Times New Roman" w:hAnsi="Times New Roman"/>
+                <w:b/>
+                <w:i w:val="0"/>
+                <w:color w:val="000000"/>
+                <w:sz w:val="18"/>
+                <w:rFonts w:ascii="Times New Roman" w:hAnsi="Times New Roman"/>
+              </w:rPr>
+              <w:t>Ours (CausalFlowNet)</w:t>
+            </w:r>
+          </w:p>
+        </w:tc>
+        <w:tc>
+          <w:tcPr>
+            <w:tcW w:type="dxa" w:w="1418"/>
+          </w:tcPr>
+          <w:p>
+            <w:pPr>
+              <w:spacing w:before="40" w:after="40"/>
+              <w:jc w:val="center"/>
+            </w:pPr>
+            <w:r>
+              <w:rPr>
+                <w:rFonts w:ascii="Times New Roman" w:hAnsi="Times New Roman"/>
+                <w:b/>
+                <w:i w:val="0"/>
+                <w:color w:val="000000"/>
+                <w:sz w:val="18"/>
+                <w:rFonts w:ascii="Times New Roman" w:hAnsi="Times New Roman"/>
+              </w:rPr>
+              <w:t>12.0</w:t>
+            </w:r>
+          </w:p>
+        </w:tc>
+        <w:tc>
+          <w:tcPr>
+            <w:tcW w:type="dxa" w:w="1418"/>
+          </w:tcPr>
+          <w:p>
+            <w:pPr>
+              <w:spacing w:before="40" w:after="40"/>
+              <w:jc w:val="center"/>
+            </w:pPr>
+            <w:r>
+              <w:rPr>
+                <w:rFonts w:ascii="Times New Roman" w:hAnsi="Times New Roman"/>
+                <w:b/>
+                <w:i w:val="0"/>
+                <w:color w:val="000000"/>
+                <w:sz w:val="18"/>
+                <w:rFonts w:ascii="Times New Roman" w:hAnsi="Times New Roman"/>
+              </w:rPr>
+              <w:t>16.0</w:t>
+            </w:r>
+          </w:p>
+        </w:tc>
+        <w:tc>
+          <w:tcPr>
+            <w:tcW w:type="dxa" w:w="1418"/>
+          </w:tcPr>
+          <w:p>
+            <w:pPr>
+              <w:spacing w:before="40" w:after="40"/>
+              <w:jc w:val="center"/>
+            </w:pPr>
+            <w:r>
+              <w:rPr>
+                <w:rFonts w:ascii="Times New Roman" w:hAnsi="Times New Roman"/>
+                <w:b/>
+                <w:i w:val="0"/>
+                <w:color w:val="000000"/>
+                <w:sz w:val="18"/>
+                <w:rFonts w:ascii="Times New Roman" w:hAnsi="Times New Roman"/>
+              </w:rPr>
+              <w:t>37.0</w:t>
+            </w:r>
+          </w:p>
+        </w:tc>
+        <w:tc>
+          <w:tcPr>
+            <w:tcW w:type="dxa" w:w="1418"/>
+          </w:tcPr>
+          <w:p>
+            <w:pPr>
+              <w:spacing w:before="40" w:after="40"/>
+              <w:jc w:val="center"/>
+            </w:pPr>
+            <w:r>
+              <w:rPr>
+                <w:rFonts w:ascii="Times New Roman" w:hAnsi="Times New Roman"/>
+                <w:b/>
+                <w:i w:val="0"/>
+                <w:color w:val="000000"/>
+                <w:sz w:val="18"/>
+                <w:rFonts w:ascii="Times New Roman" w:hAnsi="Times New Roman"/>
+              </w:rPr>
+              <w:t>25.0</w:t>
+            </w:r>
+          </w:p>
+        </w:tc>
+        <w:tc>
+          <w:tcPr>
+            <w:tcW w:type="dxa" w:w="1418"/>
+          </w:tcPr>
+          <w:p>
+            <w:pPr>
+              <w:spacing w:before="40" w:after="40"/>
+              <w:jc w:val="center"/>
+            </w:pPr>
+            <w:r>
+              <w:rPr>
+                <w:rFonts w:ascii="Times New Roman" w:hAnsi="Times New Roman"/>
+                <w:b/>
+                <w:i w:val="0"/>
+                <w:color w:val="000000"/>
+                <w:sz w:val="18"/>
+                <w:rFonts w:ascii="Times New Roman" w:hAnsi="Times New Roman"/>
+              </w:rPr>
+              <w:t>35.0</w:t>
+            </w:r>
+          </w:p>
+        </w:tc>
+        <w:tc>
+          <w:tcPr>
+            <w:tcW w:type="dxa" w:w="1418"/>
+          </w:tcPr>
+          <w:p>
+            <w:pPr>
+              <w:spacing w:before="40" w:after="40"/>
+              <w:jc w:val="center"/>
+            </w:pPr>
+            <w:r>
+              <w:rPr>
+                <w:rFonts w:ascii="Times New Roman" w:hAnsi="Times New Roman"/>
+                <w:b/>
+                <w:i w:val="0"/>
+                <w:color w:val="000000"/>
+                <w:sz w:val="18"/>
+                <w:rFonts w:ascii="Times New Roman" w:hAnsi="Times New Roman"/>
+              </w:rPr>
+              <w:t>166.0</w:t>
             </w:r>
           </w:p>
         </w:tc>
@@ -195,190 +2533,26 @@
     </w:tbl>
     <w:p>
       <w:pPr>
-        <w:spacing w:before="240" w:after="240"/>
-      </w:pPr>
-      <w:r>
-        <w:rPr>
-          <w:color w:val="B4B4B4"/>
-        </w:rPr>
-        <w:t>_________________________________________________________________________________</w:t>
-      </w:r>
-    </w:p>
-    <w:p>
-      <w:pPr>
-        <w:spacing w:after="120" w:before="120" w:line="240" w:lineRule="auto"/>
-        <w:jc w:val="center"/>
+        <w:keepNext/>
+        <w:spacing w:before="120" w:after="80"/>
+        <w:ind w:left="202"/>
       </w:pPr>
       <w:r>
         <w:rPr>
           <w:rFonts w:ascii="Times New Roman" w:hAnsi="Times New Roman"/>
           <w:b/>
-          <w:i w:val="0"/>
-          <w:sz w:val="26"/>
+          <w:i/>
+          <w:color w:val="000000"/>
+          <w:sz w:val="20"/>
+          <w:rFonts w:ascii="Times New Roman" w:hAnsi="Times New Roman"/>
         </w:rPr>
-        <w:t>NGHIÊN CỨU VÀ XÂY DỰNG KIẾN TRÚC MÔ HÌNH HỌC SÂU ĐỂ KHÁM PHÁ CẤU TRÚC NHÂN QUẢ PHI TUYẾN TÍNH TỪ DỮ LIỆU QUAN SÁT</w:t>
+        <w:t>3.2 Đánh giá và thảo luận kết quả</w:t>
       </w:r>
     </w:p>
     <w:p>
       <w:pPr>
-        <w:spacing w:after="60" w:before="0" w:line="240" w:lineRule="auto"/>
-        <w:jc w:val="right"/>
-      </w:pPr>
-      <w:r>
-        <w:rPr>
-          <w:rFonts w:ascii="Times New Roman" w:hAnsi="Times New Roman"/>
-          <w:b/>
-          <w:i w:val="0"/>
-          <w:sz w:val="22"/>
-        </w:rPr>
-        <w:t>Trần Mạnh Thái1*, Diệp Thị Mỹ Hằng1, Trần Thanh Phương1</w:t>
-      </w:r>
-    </w:p>
-    <w:p>
-      <w:pPr>
-        <w:spacing w:after="240" w:before="0" w:line="240" w:lineRule="auto"/>
-        <w:jc w:val="right"/>
-      </w:pPr>
-      <w:r>
-        <w:rPr>
-          <w:rFonts w:ascii="Times New Roman" w:hAnsi="Times New Roman"/>
-          <w:b w:val="0"/>
-          <w:i/>
-          <w:sz w:val="19"/>
-        </w:rPr>
-        <w:t>1Khoa Công nghệ Thông tin, Trường Đại học Lạc Hồng, Đồng Nai, Việt Nam</w:t>
-      </w:r>
-    </w:p>
-    <w:tbl>
-      <w:tblPr>
-        <w:tblW w:type="auto" w:w="0"/>
-        <w:tblLayout w:type="fixed"/>
-        <w:tblLook w:firstColumn="1" w:firstRow="1" w:lastColumn="0" w:lastRow="0" w:noHBand="0" w:noVBand="1" w:val="04A0"/>
-      </w:tblPr>
-      <w:tblGrid>
-        <w:gridCol w:w="2592"/>
-        <w:gridCol w:w="7344"/>
-      </w:tblGrid>
-      <w:tr>
-        <w:tc>
-          <w:tcPr>
-            <w:tcW w:type="dxa" w:w="4968"/>
-            <w:tcMar>
-              <w:top w:w="60" w:type="dxa"/>
-              <w:bottom w:w="60" w:type="dxa"/>
-              <w:left w:w="60" w:type="dxa"/>
-              <w:right w:w="60" w:type="dxa"/>
-            </w:tcMar>
-          </w:tcPr>
-          <w:p>
-            <w:pPr>
-              <w:spacing w:after="40"/>
-            </w:pPr>
-            <w:r>
-              <w:rPr>
-                <w:b/>
-              </w:rPr>
-              <w:t>THÔNG TIN</w:t>
-              <w:br/>
-            </w:r>
-            <w:r>
-              <w:rPr>
-                <w:sz w:val="17"/>
-              </w:rPr>
-              <w:t>Ngày nhận: 15/05/2026</w:t>
-              <w:br/>
-              <w:t>Ngày sửa: 20/05/2026</w:t>
-              <w:br/>
-              <w:t>Ngày duyệt: 24/05/2026</w:t>
-              <w:br/>
-              <w:t>Ngày đăng: 27/05/2026</w:t>
-              <w:br/>
-              <w:br/>
-            </w:r>
-            <w:r>
-              <w:rPr>
-                <w:b/>
-              </w:rPr>
-              <w:t>TỪ KHÓA</w:t>
-              <w:br/>
-            </w:r>
-            <w:r>
-              <w:rPr>
-                <w:sz w:val="17"/>
-              </w:rPr>
-              <w:t>Khám phá nhân quả;</w:t>
-              <w:br/>
-              <w:t>Học sâu;</w:t>
-              <w:br/>
-              <w:t>Normalizing Flows;</w:t>
-              <w:br/>
-              <w:t>Toán tử HSIC;</w:t>
-              <w:br/>
-              <w:t>Gated-ResMLP.</w:t>
-            </w:r>
-          </w:p>
-        </w:tc>
-        <w:tc>
-          <w:tcPr>
-            <w:tcW w:type="dxa" w:w="4968"/>
-            <w:tcMar>
-              <w:top w:w="60" w:type="dxa"/>
-              <w:bottom w:w="60" w:type="dxa"/>
-              <w:left w:w="60" w:type="dxa"/>
-              <w:right w:w="60" w:type="dxa"/>
-            </w:tcMar>
-          </w:tcPr>
-          <w:p>
-            <w:pPr>
-              <w:spacing w:line="240" w:lineRule="auto"/>
-              <w:jc w:val="both"/>
-            </w:pPr>
-            <w:r>
-              <w:rPr>
-                <w:b/>
-              </w:rPr>
-              <w:t>TÓM TẮT</w:t>
-              <w:br/>
-            </w:r>
-            <w:r>
-              <w:rPr>
-                <w:sz w:val="18"/>
-              </w:rPr>
-              <w:t>Khám phá cấu trúc nhân quả từ dữ liệu quan sát là một thách thức nền tảng trong học máy và thống kê. Các hướng tiếp cận truyền thống thường giả định mối quan hệ tuyến tính hoặc các mô hình nhiễu Gaussian đơn giản, điều này làm hạn chế hiệu quả của chúng trên các tập dữ liệu thực tế đặc trưng bởi các tương tác phi tuyến và phân phối nhiễu phức tạp. Trong nghiên cứu này, chúng tôi đề xuất CausalFlowNet, một khung học sâu mới tích hợp mạng Perceptron nhiều lớp tăng cường Gated Residual (Gated-ResMLP) với dòng chuẩn hóa Neural Spline Flows (NSF) dưới khung tối ưu hóa Lagrangian tăng cường. Cụ thể, Gated-ResMLP học các hàm nhân quả phi tuyến phức tạp, trong khi NSF mô hình hóa các phân phối nhiễu phần dư không phải Gaussian tùy ý bằng cách sử dụng các spline bậc hai hữu tỷ. Để đảm bảo tính định hướng nhân quả thực sự, chúng tôi giới thiệu tiêu chuẩn độc lập Hilbert-Schmidt nhanh song song (Fast HSIC) như một bộ điều chuẩn độc lập thống kê. Các đánh giá thực nghiệm trên tập dữ liệu truyền tín hiệu protein Sachs thực tế và mạng lưới gen giả lập SynTReN chứng minh rằng CausalFlowNet đạt được hiệu suất vượt trội, đạt được Khoảng cách Hamming Cấu trúc (SHD) là 12.0 và Khoảng cách Can thiệp Cấu trúc (SID) là 37.0, vượt qua các mô hình cơ sở hiện có như NOTEARS, DAG-GNN và GraN-DAG. Mô hình cung cấp một giải pháp mạnh mẽ và có thể mở rộng để khám phá mạng lưới nhân quả phi tuyến từ dữ liệu quan sát dạng bảng.</w:t>
-            </w:r>
-          </w:p>
-        </w:tc>
-      </w:tr>
-    </w:tbl>
-    <w:p>
-      <w:pPr>
-        <w:sectPr>
-          <w:pgSz w:w="11909" w:h="16834"/>
-          <w:pgMar w:top="850" w:right="562" w:bottom="850" w:left="1411" w:header="720" w:footer="720" w:gutter="0"/>
-          <w:cols w:space="720"/>
-          <w:docGrid w:linePitch="360"/>
-        </w:sectPr>
-      </w:pPr>
-    </w:p>
-    <w:p>
-      <w:pPr>
-        <w:spacing w:after="80" w:before="240" w:line="240" w:lineRule="auto"/>
-        <w:jc w:val="left"/>
-      </w:pPr>
-      <w:r>
-        <w:rPr>
-          <w:rFonts w:ascii="Times New Roman" w:hAnsi="Times New Roman"/>
-          <w:b/>
-          <w:i w:val="0"/>
-          <w:sz w:val="20"/>
-        </w:rPr>
-        <w:t>1. GIỚI THIỆU (INTRODUCTION)</w:t>
-      </w:r>
-    </w:p>
-    <w:p>
-      <w:pPr>
-        <w:spacing w:after="120" w:before="0" w:line="240" w:lineRule="auto"/>
-        <w:ind w:firstLine="216"/>
+        <w:spacing w:before="0" w:after="120" w:line="240" w:lineRule="auto"/>
+        <w:ind w:firstLine="202"/>
         <w:jc w:val="both"/>
       </w:pPr>
       <w:r>
@@ -386,15 +2560,17 @@
           <w:rFonts w:ascii="Times New Roman" w:hAnsi="Times New Roman"/>
           <w:b w:val="0"/>
           <w:i w:val="0"/>
+          <w:color w:val="000000"/>
           <w:sz w:val="20"/>
+          <w:rFonts w:ascii="Times New Roman" w:hAnsi="Times New Roman"/>
         </w:rPr>
-        <w:t>Khám phá và mô hình hóa mối quan hệ nhân quả (Causal Discovery) từ dữ liệu quan sát dạng bảng là một trong những mục tiêu cốt lõi của Trí tuệ nhân tạo hiện đại. Khác với mô hình học máy truyền thống chỉ tập trung khai thác mối quan hệ tương quan thống kê thuần túy (Correlation), suy luận nhân quả nhằm bóc tách các cơ chế tác động trực tiếp thực tế giữa các biến số, giúp giải thích chính xác câu hỏi can thiệp thực nghiệm thông qua toán tử do-calculus của Judea Pearl [6].</w:t>
+        <w:t>Kết quả tại Bảng 1 chỉ ra hiệu năng vượt trội của CausalFlowNet so với các thuật toán baseline mạnh nhất hiện nay: Trên tập dữ liệu sinh học thực tế Sachs, CausalFlowNet đạt chỉ số SHD = 12.0 (tốt nhất, ngang hàng với CAM) và đặc biệt đạt chỉ số SID = 37.0 vượt trội hơn hẳn so với GraN-DAG (47.0) hay CAM (55.0). Chỉ số SID thấp khẳng định mô hình có khả năng dự đoán chính xác các tác động can thiệp (Intervention) sinh học, đáp ứng trọn vẹn mục tiêu suy luận nhân quả y sinh học thực tiễn.</w:t>
       </w:r>
     </w:p>
     <w:p>
       <w:pPr>
-        <w:spacing w:after="120" w:before="0" w:line="240" w:lineRule="auto"/>
-        <w:ind w:firstLine="216"/>
+        <w:spacing w:before="0" w:after="120" w:line="240" w:lineRule="auto"/>
+        <w:ind w:firstLine="202"/>
         <w:jc w:val="both"/>
       </w:pPr>
       <w:r>
@@ -402,15 +2578,35 @@
           <w:rFonts w:ascii="Times New Roman" w:hAnsi="Times New Roman"/>
           <w:b w:val="0"/>
           <w:i w:val="0"/>
+          <w:color w:val="000000"/>
           <w:sz w:val="20"/>
+          <w:rFonts w:ascii="Times New Roman" w:hAnsi="Times New Roman"/>
         </w:rPr>
-        <w:t>Các phương pháp khám phá cấu trúc nhân quả cổ điển, bao gồm hướng tiếp cận dựa trên ràng buộc thống kê như PC [11] hay hướng tiếp cận dựa trên điểm số như GES [2], thường đòi hỏi giả định rất ngặt nghèo về tính tuyến tính và phân phối nhiễu đồng nhất. Bước ngoặt lớn đến từ NOTEARS [13], khi chuyển đổi không gian tìm kiếm đồ thị rời rạc thành một bài toán tối ưu hóa liên tục trơn tru thông qua ràng buộc phi chu trình ma trận h(W) = 0. Tuy nhiên, các mô hình thế hệ đầu này vẫn bị giới hạn trong các phương trình tuyến tính và mô hình nhiễu Gaussian đơn giản.</w:t>
+        <w:t>Trên tập dữ liệu mô phỏng quy mô lớn hơn SynTReN (20 nút), CausalFlowNet bộc lộ sức mạnh học phi tuyến vượt trội khi đạt SHD = 25.0, vượt qua GraN-DAG++ (33.7) và bỏ xa mô hình tuyến tính NOTEARS (151.8). Sự ổn định này có được nhờ cơ chế ước lượng mật độ linh hoạt của Spline Flow, giúp mô hình hóa trơn tru các phần dư phi chuẩn và phức tạp do động học tế bào sinh ra.</w:t>
       </w:r>
     </w:p>
     <w:p>
       <w:pPr>
-        <w:spacing w:after="120" w:before="0" w:line="240" w:lineRule="auto"/>
-        <w:ind w:firstLine="216"/>
+        <w:keepNext/>
+        <w:spacing w:before="240" w:after="120"/>
+        <w:ind w:left="202"/>
+      </w:pPr>
+      <w:r>
+        <w:rPr>
+          <w:rFonts w:ascii="Times New Roman" w:hAnsi="Times New Roman"/>
+          <w:b/>
+          <w:i w:val="0"/>
+          <w:color w:val="000000"/>
+          <w:sz w:val="20"/>
+          <w:rFonts w:ascii="Times New Roman" w:hAnsi="Times New Roman"/>
+        </w:rPr>
+        <w:t>4. KẾT LUẬN VÀ HƯỚNG PHÁT TRIỂN (CONCLUSION)</w:t>
+      </w:r>
+    </w:p>
+    <w:p>
+      <w:pPr>
+        <w:spacing w:before="0" w:after="120" w:line="240" w:lineRule="auto"/>
+        <w:ind w:firstLine="202"/>
         <w:jc w:val="both"/>
       </w:pPr>
       <w:r>
@@ -418,30 +2614,35 @@
           <w:rFonts w:ascii="Times New Roman" w:hAnsi="Times New Roman"/>
           <w:b w:val="0"/>
           <w:i w:val="0"/>
+          <w:color w:val="000000"/>
           <w:sz w:val="20"/>
+          <w:rFonts w:ascii="Times New Roman" w:hAnsi="Times New Roman"/>
         </w:rPr>
-        <w:t>Trong bài viết này, chúng tôi đề xuất CausalFlowNet - một kiến trúc học sâu phi tuyến tính tích hợp để khám phá cấu trúc nhân quả từ dữ liệu quan sát dạng bảng. CausalFlowNet sử dụng mạng Gated Residual MLP (Gated-ResMLP) dùng chung trọng số để học các hàm cơ chế phi tuyến phức tạp, kết hợp với dòng chuẩn hóa Neural Spline Flows (NSF) với Gaussian Mixture Prior để mô hình hóa chính xác phân phối nhiễu tùy ý thực tế. Để đảm bảo hướng mũi tên nhân quả được định hướng chính xác và loại bỏ tương quan ảo, chúng tôi tích hợp bộ kiểm định độc lập phi tuyến song song hóa Fast HSIC làm bộ điều chuẩn trong hàm mục tiêu Augmented Lagrangian.</w:t>
+        <w:t>Nghiên cứu đã xây dựng thành công CausalFlowNet - khung học sâu thống nhất kết hợp mạng nơ-ron Gated-ResMLP phi tuyến, ước lượng mật độ NSF linh hoạt và kiểm định độc lập song song Fast HSIC. Thực nghiệm chứng minh mô hình đạt hiệu năng khám phá cấu trúc nhân quả và suy luận can thiệp hàng đầu hiện nay. Trong tương lai, chúng tôi định hướng tự động hóa tối ưu siêu tham số bằng Bayesian Optimization và mở rộng mô hình xử lý các biến ẩn không quan sát được (Unobserved Confounders).</w:t>
       </w:r>
     </w:p>
     <w:p>
       <w:pPr>
-        <w:spacing w:after="80" w:before="240" w:line="240" w:lineRule="auto"/>
-        <w:jc w:val="left"/>
+        <w:keepNext/>
+        <w:spacing w:before="240" w:after="120"/>
+        <w:ind w:left="202"/>
       </w:pPr>
       <w:r>
         <w:rPr>
           <w:rFonts w:ascii="Times New Roman" w:hAnsi="Times New Roman"/>
           <w:b/>
           <w:i w:val="0"/>
+          <w:color w:val="000000"/>
           <w:sz w:val="20"/>
+          <w:rFonts w:ascii="Times New Roman" w:hAnsi="Times New Roman"/>
         </w:rPr>
-        <w:t>2. PHƯƠNG PHÁP ĐỀ XUẤT (PROPOSED METHODOLOGY)</w:t>
+        <w:t>LỜI CẢM ƠN (ACKNOWLEDGMENTS)</w:t>
       </w:r>
     </w:p>
     <w:p>
       <w:pPr>
-        <w:spacing w:after="80" w:before="0" w:line="240" w:lineRule="auto"/>
-        <w:ind w:firstLine="216"/>
+        <w:spacing w:before="0" w:after="120" w:line="240" w:lineRule="auto"/>
+        <w:ind w:firstLine="202"/>
         <w:jc w:val="both"/>
       </w:pPr>
       <w:r>
@@ -449,45 +2650,34 @@
           <w:rFonts w:ascii="Times New Roman" w:hAnsi="Times New Roman"/>
           <w:b w:val="0"/>
           <w:i w:val="0"/>
+          <w:color w:val="000000"/>
           <w:sz w:val="20"/>
+          <w:rFonts w:ascii="Times New Roman" w:hAnsi="Times New Roman"/>
         </w:rPr>
-        <w:t>Khung làm việc SCM (Structural Causal Model) biểu diễn hệ thống dữ liệu thông qua Mô hình Nhiễu Cộng (Additive Noise Model - ANM) phi tuyến tính:</w:t>
+        <w:t>Nhóm tác giả xin gửi lời tri ân sâu sắc nhất đến Giảng viên hướng dẫn – Thầy Trần Thanh Phương vì sự dẫn dắt tận tình và định hướng chuyên môn quý báu. Đồng thời, xin cảm ơn Khoa Công nghệ Thông tin, Trường Đại học Lạc Hồng đã tạo điều kiện nghiên cứu tốt nhất để chúng tôi hoàn thành công trình này.</w:t>
       </w:r>
     </w:p>
     <w:p>
       <w:pPr>
-        <w:spacing w:after="120" w:before="0" w:line="240" w:lineRule="auto"/>
-        <w:jc w:val="center"/>
+        <w:keepNext/>
+        <w:spacing w:before="240" w:after="120"/>
+        <w:ind w:left="202"/>
       </w:pPr>
       <w:r>
         <w:rPr>
           <w:rFonts w:ascii="Times New Roman" w:hAnsi="Times New Roman"/>
           <w:b/>
           <w:i w:val="0"/>
+          <w:color w:val="000000"/>
           <w:sz w:val="20"/>
+          <w:rFonts w:ascii="Times New Roman" w:hAnsi="Times New Roman"/>
         </w:rPr>
-        <w:t>X_i = f_i(PA_i) + e_i,  với e_i indep PA_i</w:t>
+        <w:t>TÀI LIỆU THAM KHẢO (REFERENCES)</w:t>
       </w:r>
     </w:p>
     <w:p>
       <w:pPr>
-        <w:spacing w:after="60" w:before="120" w:line="240" w:lineRule="auto"/>
-        <w:jc w:val="left"/>
-      </w:pPr>
-      <w:r>
-        <w:rPr>
-          <w:rFonts w:ascii="Times New Roman" w:hAnsi="Times New Roman"/>
-          <w:b/>
-          <w:i w:val="0"/>
-          <w:sz w:val="20"/>
-        </w:rPr>
-        <w:t>2.1 Gated Residual MLP học cơ chế nhân quả</w:t>
-      </w:r>
-    </w:p>
-    <w:p>
-      <w:pPr>
-        <w:spacing w:after="120" w:before="0" w:line="240" w:lineRule="auto"/>
-        <w:ind w:firstLine="216"/>
+        <w:spacing w:before="0" w:after="80" w:line="240" w:lineRule="auto"/>
         <w:jc w:val="both"/>
       </w:pPr>
       <w:r>
@@ -495,30 +2685,16 @@
           <w:rFonts w:ascii="Times New Roman" w:hAnsi="Times New Roman"/>
           <w:b w:val="0"/>
           <w:i w:val="0"/>
-          <w:sz w:val="20"/>
+          <w:color w:val="000000"/>
+          <w:sz w:val="18"/>
+          <w:rFonts w:ascii="Times New Roman" w:hAnsi="Times New Roman"/>
         </w:rPr>
-        <w:t>Chúng tôi thiết kế khối Gated Residual Block kết hợp cơ chế cổng (gating) và kết nối tắt (residual connection) nhằm ổn định dòng gradient lan truyền ngược khi mạng có độ sâu lớn. Trọng số của các lớp tuyến tính được khởi tạo bằng phương pháp khởi tạo trực giao (Orthogonal Initialization) với hệ số gain = 1.4 để ngăn ngừa bùng nổ gradient. Đầu vào được áp dụng mặt nạ mềm (soft mask) dựa trên ma trận kề W khả vi để kiểm soát dòng thông tin nhân quả.</w:t>
+        <w:t>[1] Bello, K., Aragam, B., &amp; Ravikumar, P. (2022). DAGMA: Learning DAGs via M-matrices and a Log-Determinant Acyclicity Characterization. Advances in Neural Information Processing Systems, 35.</w:t>
       </w:r>
     </w:p>
     <w:p>
       <w:pPr>
-        <w:spacing w:after="60" w:before="120" w:line="240" w:lineRule="auto"/>
-        <w:jc w:val="left"/>
-      </w:pPr>
-      <w:r>
-        <w:rPr>
-          <w:rFonts w:ascii="Times New Roman" w:hAnsi="Times New Roman"/>
-          <w:b/>
-          <w:i w:val="0"/>
-          <w:sz w:val="20"/>
-        </w:rPr>
-        <w:t>2.2 Neural Spline Flow mô hình hóa nhiễu tùy ý</w:t>
-      </w:r>
-    </w:p>
-    <w:p>
-      <w:pPr>
-        <w:spacing w:after="120" w:before="0" w:line="240" w:lineRule="auto"/>
-        <w:ind w:firstLine="216"/>
+        <w:spacing w:before="0" w:after="80" w:line="240" w:lineRule="auto"/>
         <w:jc w:val="both"/>
       </w:pPr>
       <w:r>
@@ -526,30 +2702,16 @@
           <w:rFonts w:ascii="Times New Roman" w:hAnsi="Times New Roman"/>
           <w:b w:val="0"/>
           <w:i w:val="0"/>
-          <w:sz w:val="20"/>
+          <w:color w:val="000000"/>
+          <w:sz w:val="18"/>
+          <w:rFonts w:ascii="Times New Roman" w:hAnsi="Times New Roman"/>
         </w:rPr>
-        <w:t>Thay vì giả định nhiễu tuân theo phân phối chuẩn Gaussian đơn giản, CausalFlowNet sử dụng lớp ghép Rational-Quadratic Splines (RQS) để chia miền dữ liệu thành các bins (mặc định num_bins = 8) và xấp xỉ phân phối phần dư bằng hàm hữu tỷ bậc hai. Hàm log-likelihood chính xác được tính thông qua định lý đổi biến, tích lũy log-determinant của ma trận Jacobian tại mỗi lớp spline. Bên cạnh đó, mô hình tích hợp Gaussian Mixture Model (GMM) làm phân phối ưu tiên (prior) để nắm bắt phân phối đa chế độ (multi-modal).</w:t>
+        <w:t>[2] Chickering, D. M. (2002). Optimal structure identification with greedy search. Journal of Machine Learning Research, 3(Nov), 507-554.</w:t>
       </w:r>
     </w:p>
     <w:p>
       <w:pPr>
-        <w:spacing w:after="60" w:before="120" w:line="240" w:lineRule="auto"/>
-        <w:jc w:val="left"/>
-      </w:pPr>
-      <w:r>
-        <w:rPr>
-          <w:rFonts w:ascii="Times New Roman" w:hAnsi="Times New Roman"/>
-          <w:b/>
-          <w:i w:val="0"/>
-          <w:sz w:val="20"/>
-        </w:rPr>
-        <w:t>2.3 Ràng buộc độc lập bằng Parallel Fast HSIC</w:t>
-      </w:r>
-    </w:p>
-    <w:p>
-      <w:pPr>
-        <w:spacing w:after="120" w:before="0" w:line="240" w:lineRule="auto"/>
-        <w:ind w:firstLine="216"/>
+        <w:spacing w:before="0" w:after="80" w:line="240" w:lineRule="auto"/>
         <w:jc w:val="both"/>
       </w:pPr>
       <w:r>
@@ -557,30 +2719,16 @@
           <w:rFonts w:ascii="Times New Roman" w:hAnsi="Times New Roman"/>
           <w:b w:val="0"/>
           <w:i w:val="0"/>
-          <w:sz w:val="20"/>
+          <w:color w:val="000000"/>
+          <w:sz w:val="18"/>
+          <w:rFonts w:ascii="Times New Roman" w:hAnsi="Times New Roman"/>
         </w:rPr>
-        <w:t>Để đảm bảo tính độc lập thống kê giữa phần dư e_i và tập nguyên nhân PA_i, chúng tôi sử dụng tiêu chuẩn đo lường phụ thuộc phi tuyến HSIC [4]. Để tối ưu tốc độ tính toán từ O(N^2) xuống mức tuyến tính, chúng tôi áp dụng phương pháp xấp xỉ nhanh bằng Random Fourier Features (RFF) với m = 32 đặc trưng ngẫu nhiên. Toàn bộ phép tính HSIC cho tất cả các cặp biến được song song hóa hoàn toàn trong một phép toán tensor duy nhất.</w:t>
+        <w:t>[3] Durkan, C., Bekasov, A., Murray, I., &amp; Papamakarios, G. (2019). Neural spline flows. Advances in Neural Information Processing Systems, 32.</w:t>
       </w:r>
     </w:p>
     <w:p>
       <w:pPr>
-        <w:spacing w:after="60" w:before="120" w:line="240" w:lineRule="auto"/>
-        <w:jc w:val="left"/>
-      </w:pPr>
-      <w:r>
-        <w:rPr>
-          <w:rFonts w:ascii="Times New Roman" w:hAnsi="Times New Roman"/>
-          <w:b/>
-          <w:i w:val="0"/>
-          <w:sz w:val="20"/>
-        </w:rPr>
-        <w:t>2.4 Hàm mục tiêu tối ưu hóa liên tục</w:t>
-      </w:r>
-    </w:p>
-    <w:p>
-      <w:pPr>
-        <w:spacing w:after="80" w:before="0" w:line="240" w:lineRule="auto"/>
-        <w:ind w:firstLine="216"/>
+        <w:spacing w:before="0" w:after="80" w:line="240" w:lineRule="auto"/>
         <w:jc w:val="both"/>
       </w:pPr>
       <w:r>
@@ -588,30 +2736,16 @@
           <w:rFonts w:ascii="Times New Roman" w:hAnsi="Times New Roman"/>
           <w:b w:val="0"/>
           <w:i w:val="0"/>
-          <w:sz w:val="20"/>
+          <w:color w:val="000000"/>
+          <w:sz w:val="18"/>
+          <w:rFonts w:ascii="Times New Roman" w:hAnsi="Times New Roman"/>
         </w:rPr>
-        <w:t>Bài toán tối ưu hóa có ràng buộc phi chu trình h(W) = 0 được chuyển đổi thành bài toán không ràng buộc thông qua thuật toán Lagrangian tăng cường kép (Augmented Lagrangian Method - ALM) [15]:</w:t>
+        <w:t>[4] Gretton, A., Bousquet, O., Smola, A., &amp; Schölkopf, B. (2005). Measuring statistical dependence with Hilbert-Schmidt norms. In Algorithmic Learning Theory, p. 63-77.</w:t>
       </w:r>
     </w:p>
     <w:p>
       <w:pPr>
-        <w:spacing w:after="120" w:before="0" w:line="240" w:lineRule="auto"/>
-        <w:jc w:val="center"/>
-      </w:pPr>
-      <w:r>
-        <w:rPr>
-          <w:rFonts w:ascii="Times New Roman" w:hAnsi="Times New Roman"/>
-          <w:b/>
-          <w:i w:val="0"/>
-          <w:sz w:val="19"/>
-        </w:rPr>
-        <w:t>L_aug = (NLL + lda_hsic * L_HSIC + lda_L1 * |W|_1) + alpha * h(W) + 0.5 * rho * h(W)^2</w:t>
-      </w:r>
-    </w:p>
-    <w:p>
-      <w:pPr>
-        <w:spacing w:after="120" w:before="0" w:line="240" w:lineRule="auto"/>
-        <w:ind w:firstLine="216"/>
+        <w:spacing w:before="0" w:after="80" w:line="240" w:lineRule="auto"/>
         <w:jc w:val="both"/>
       </w:pPr>
       <w:r>
@@ -619,30 +2753,16 @@
           <w:rFonts w:ascii="Times New Roman" w:hAnsi="Times New Roman"/>
           <w:b w:val="0"/>
           <w:i w:val="0"/>
-          <w:sz w:val="20"/>
+          <w:color w:val="000000"/>
+          <w:sz w:val="18"/>
+          <w:rFonts w:ascii="Times New Roman" w:hAnsi="Times New Roman"/>
         </w:rPr>
-        <w:t>Nhân tử Lagrange (alpha) đóng vai trò bộ nhớ vi phạm tích lũy và tham số phạt (rho) đóng vai trò độ nghiêm khắc được cập nhật tuần tự sau mỗi vòng lặp ngoài (outer loop) để ép đồ thị hội tụ về cấu trúc DAG hợp lệ.</w:t>
+        <w:t>[5] Hu, S., Chen, Z., et al. (2018). Causal Inference and Mechanism Clustering of A Mixture of Additive Noise Models (ANM-MM). Advances in Neural Information Processing Systems (NeurIPS), 31.</w:t>
       </w:r>
     </w:p>
     <w:p>
       <w:pPr>
-        <w:spacing w:after="80" w:before="240" w:line="240" w:lineRule="auto"/>
-        <w:jc w:val="left"/>
-      </w:pPr>
-      <w:r>
-        <w:rPr>
-          <w:rFonts w:ascii="Times New Roman" w:hAnsi="Times New Roman"/>
-          <w:b/>
-          <w:i w:val="0"/>
-          <w:sz w:val="20"/>
-        </w:rPr>
-        <w:t>3. KẾT QUẢ THỰC NGHIỆM VÀ THẢO LUẬN (EXPERIMENTAL RESULTS &amp; DISCUSSION)</w:t>
-      </w:r>
-    </w:p>
-    <w:p>
-      <w:pPr>
-        <w:spacing w:after="120" w:before="0" w:line="240" w:lineRule="auto"/>
-        <w:ind w:firstLine="216"/>
+        <w:spacing w:before="0" w:after="80" w:line="240" w:lineRule="auto"/>
         <w:jc w:val="both"/>
       </w:pPr>
       <w:r>
@@ -650,30 +2770,16 @@
           <w:rFonts w:ascii="Times New Roman" w:hAnsi="Times New Roman"/>
           <w:b w:val="0"/>
           <w:i w:val="0"/>
-          <w:sz w:val="20"/>
+          <w:color w:val="000000"/>
+          <w:sz w:val="18"/>
+          <w:rFonts w:ascii="Times New Roman" w:hAnsi="Times New Roman"/>
         </w:rPr>
-        <w:t>Chúng tôi tiến hành đánh giá hiệu năng của CausalFlowNet trên hai tập dữ liệu chuẩn: Dữ liệu thực tế truyền tín hiệu protein tế bào Sachs (11 biến, 7466 mẫu) [9] và Dữ liệu mạng gen mô phỏng SynTReN (20 biến, 1000 mẫu) [12].</w:t>
+        <w:t>[6] Pearl, J. (2000). Causality: Models, Reasoning and Inference. Cambridge University Press.</w:t>
       </w:r>
     </w:p>
     <w:p>
       <w:pPr>
-        <w:spacing w:after="60" w:before="120" w:line="240" w:lineRule="auto"/>
-        <w:jc w:val="left"/>
-      </w:pPr>
-      <w:r>
-        <w:rPr>
-          <w:rFonts w:ascii="Times New Roman" w:hAnsi="Times New Roman"/>
-          <w:b/>
-          <w:i w:val="0"/>
-          <w:sz w:val="20"/>
-        </w:rPr>
-        <w:t>3.1 Hiệu năng trên tập dữ liệu thực tế Sachs</w:t>
-      </w:r>
-    </w:p>
-    <w:p>
-      <w:pPr>
-        <w:spacing w:after="120" w:before="0" w:line="240" w:lineRule="auto"/>
-        <w:ind w:firstLine="216"/>
+        <w:spacing w:before="0" w:after="80" w:line="240" w:lineRule="auto"/>
         <w:jc w:val="both"/>
       </w:pPr>
       <w:r>
@@ -681,984 +2787,16 @@
           <w:rFonts w:ascii="Times New Roman" w:hAnsi="Times New Roman"/>
           <w:b w:val="0"/>
           <w:i w:val="0"/>
-          <w:sz w:val="20"/>
+          <w:color w:val="000000"/>
+          <w:sz w:val="18"/>
+          <w:rFonts w:ascii="Times New Roman" w:hAnsi="Times New Roman"/>
         </w:rPr>
-        <w:t>Kết quả đánh giá định lượng được trình bày chi tiết trong Bảng 1. CausalFlowNet đạt được chỉ số SHD = 12.0 và SID = 37.0, phát hiện chính xác các cạnh sinh học cốt lõi như praf -&gt; pmek (hệ số ATE đạt +1.176), plcg -&gt; PIP2, và PKC -&gt; P38. Mô hình duy trì tỷ lệ báo nhầm (FPR) ở mức cực kỳ thấp (0.06), đảm bảo tính ổn định tối ưu.</w:t>
+        <w:t>[7] Peters, J., &amp; Bühlmann, P. (2015). Structural intervention distance for evaluating causal graphs. Neural Computation, 27(3), 771-799.</w:t>
       </w:r>
     </w:p>
     <w:p>
       <w:pPr>
-        <w:spacing w:after="80" w:before="160" w:line="240" w:lineRule="auto"/>
-        <w:jc w:val="center"/>
-      </w:pPr>
-      <w:r>
-        <w:rPr>
-          <w:rFonts w:ascii="Times New Roman" w:hAnsi="Times New Roman"/>
-          <w:b/>
-          <w:i w:val="0"/>
-          <w:sz w:val="18"/>
-        </w:rPr>
-        <w:t>Bảng 1. So sánh hiệu năng khám phá nhân quả trên tập Sachs và SynTReN-20.</w:t>
-      </w:r>
-    </w:p>
-    <w:tbl>
-      <w:tblPr>
-        <w:tblStyle w:val="TableGrid"/>
-        <w:tblW w:type="auto" w:w="0"/>
-        <w:tblLook w:firstColumn="1" w:firstRow="1" w:lastColumn="0" w:lastRow="0" w:noHBand="0" w:noVBand="1" w:val="04A0"/>
-      </w:tblPr>
-      <w:tblGrid>
-        <w:gridCol w:w="1419"/>
-        <w:gridCol w:w="1419"/>
-        <w:gridCol w:w="1419"/>
-        <w:gridCol w:w="1419"/>
-        <w:gridCol w:w="1419"/>
-        <w:gridCol w:w="1419"/>
-        <w:gridCol w:w="1419"/>
-      </w:tblGrid>
-      <w:tr>
-        <w:tc>
-          <w:tcPr>
-            <w:tcW w:type="dxa" w:w="1419"/>
-            <w:tcMar>
-              <w:top w:w="50" w:type="dxa"/>
-              <w:bottom w:w="50" w:type="dxa"/>
-              <w:left w:w="50" w:type="dxa"/>
-              <w:right w:w="50" w:type="dxa"/>
-            </w:tcMar>
-          </w:tcPr>
-          <w:p>
-            <w:pPr>
-              <w:jc w:val="center"/>
-            </w:pPr>
-            <w:r>
-              <w:rPr>
-                <w:b/>
-                <w:sz w:val="17"/>
-              </w:rPr>
-              <w:t>Phương pháp</w:t>
-            </w:r>
-          </w:p>
-        </w:tc>
-        <w:tc>
-          <w:tcPr>
-            <w:tcW w:type="dxa" w:w="1419"/>
-            <w:tcMar>
-              <w:top w:w="50" w:type="dxa"/>
-              <w:bottom w:w="50" w:type="dxa"/>
-              <w:left w:w="50" w:type="dxa"/>
-              <w:right w:w="50" w:type="dxa"/>
-            </w:tcMar>
-          </w:tcPr>
-          <w:p>
-            <w:pPr>
-              <w:jc w:val="center"/>
-            </w:pPr>
-            <w:r>
-              <w:rPr>
-                <w:b/>
-                <w:sz w:val="17"/>
-              </w:rPr>
-              <w:t>SHD (Sachs)</w:t>
-            </w:r>
-          </w:p>
-        </w:tc>
-        <w:tc>
-          <w:tcPr>
-            <w:tcW w:type="dxa" w:w="1419"/>
-            <w:tcMar>
-              <w:top w:w="50" w:type="dxa"/>
-              <w:bottom w:w="50" w:type="dxa"/>
-              <w:left w:w="50" w:type="dxa"/>
-              <w:right w:w="50" w:type="dxa"/>
-            </w:tcMar>
-          </w:tcPr>
-          <w:p>
-            <w:pPr>
-              <w:jc w:val="center"/>
-            </w:pPr>
-            <w:r>
-              <w:rPr>
-                <w:b/>
-                <w:sz w:val="17"/>
-              </w:rPr>
-              <w:t>SID (Sachs)</w:t>
-            </w:r>
-          </w:p>
-        </w:tc>
-        <w:tc>
-          <w:tcPr>
-            <w:tcW w:type="dxa" w:w="1419"/>
-            <w:tcMar>
-              <w:top w:w="50" w:type="dxa"/>
-              <w:bottom w:w="50" w:type="dxa"/>
-              <w:left w:w="50" w:type="dxa"/>
-              <w:right w:w="50" w:type="dxa"/>
-            </w:tcMar>
-          </w:tcPr>
-          <w:p>
-            <w:pPr>
-              <w:jc w:val="center"/>
-            </w:pPr>
-            <w:r>
-              <w:rPr>
-                <w:b/>
-                <w:sz w:val="17"/>
-              </w:rPr>
-              <w:t>FPR (Sachs)</w:t>
-            </w:r>
-          </w:p>
-        </w:tc>
-        <w:tc>
-          <w:tcPr>
-            <w:tcW w:type="dxa" w:w="1419"/>
-            <w:tcMar>
-              <w:top w:w="50" w:type="dxa"/>
-              <w:bottom w:w="50" w:type="dxa"/>
-              <w:left w:w="50" w:type="dxa"/>
-              <w:right w:w="50" w:type="dxa"/>
-            </w:tcMar>
-          </w:tcPr>
-          <w:p>
-            <w:pPr>
-              <w:jc w:val="center"/>
-            </w:pPr>
-            <w:r>
-              <w:rPr>
-                <w:b/>
-                <w:sz w:val="17"/>
-              </w:rPr>
-              <w:t>SHD (Syn)</w:t>
-            </w:r>
-          </w:p>
-        </w:tc>
-        <w:tc>
-          <w:tcPr>
-            <w:tcW w:type="dxa" w:w="1419"/>
-            <w:tcMar>
-              <w:top w:w="50" w:type="dxa"/>
-              <w:bottom w:w="50" w:type="dxa"/>
-              <w:left w:w="50" w:type="dxa"/>
-              <w:right w:w="50" w:type="dxa"/>
-            </w:tcMar>
-          </w:tcPr>
-          <w:p>
-            <w:pPr>
-              <w:jc w:val="center"/>
-            </w:pPr>
-            <w:r>
-              <w:rPr>
-                <w:b/>
-                <w:sz w:val="17"/>
-              </w:rPr>
-              <w:t>SID (Syn)</w:t>
-            </w:r>
-          </w:p>
-        </w:tc>
-        <w:tc>
-          <w:tcPr>
-            <w:tcW w:type="dxa" w:w="1419"/>
-            <w:tcMar>
-              <w:top w:w="50" w:type="dxa"/>
-              <w:bottom w:w="50" w:type="dxa"/>
-              <w:left w:w="50" w:type="dxa"/>
-              <w:right w:w="50" w:type="dxa"/>
-            </w:tcMar>
-          </w:tcPr>
-          <w:p>
-            <w:pPr>
-              <w:jc w:val="center"/>
-            </w:pPr>
-            <w:r>
-              <w:rPr>
-                <w:b/>
-                <w:sz w:val="17"/>
-              </w:rPr>
-              <w:t>FPR (Syn)</w:t>
-            </w:r>
-          </w:p>
-        </w:tc>
-      </w:tr>
-      <w:tr>
-        <w:tc>
-          <w:tcPr>
-            <w:tcW w:type="dxa" w:w="1419"/>
-            <w:tcMar>
-              <w:top w:w="40" w:type="dxa"/>
-              <w:bottom w:w="40" w:type="dxa"/>
-              <w:left w:w="40" w:type="dxa"/>
-              <w:right w:w="40" w:type="dxa"/>
-            </w:tcMar>
-          </w:tcPr>
-          <w:p>
-            <w:r>
-              <w:rPr>
-                <w:b/>
-                <w:sz w:val="17"/>
-              </w:rPr>
-              <w:t>NOTEARS [13]</w:t>
-            </w:r>
-          </w:p>
-        </w:tc>
-        <w:tc>
-          <w:tcPr>
-            <w:tcW w:type="dxa" w:w="1419"/>
-            <w:tcMar>
-              <w:top w:w="40" w:type="dxa"/>
-              <w:bottom w:w="40" w:type="dxa"/>
-              <w:left w:w="40" w:type="dxa"/>
-              <w:right w:w="40" w:type="dxa"/>
-            </w:tcMar>
-          </w:tcPr>
-          <w:p>
-            <w:pPr>
-              <w:jc w:val="center"/>
-            </w:pPr>
-            <w:r>
-              <w:rPr>
-                <w:sz w:val="17"/>
-              </w:rPr>
-              <w:t>21.0</w:t>
-            </w:r>
-          </w:p>
-        </w:tc>
-        <w:tc>
-          <w:tcPr>
-            <w:tcW w:type="dxa" w:w="1419"/>
-            <w:tcMar>
-              <w:top w:w="40" w:type="dxa"/>
-              <w:bottom w:w="40" w:type="dxa"/>
-              <w:left w:w="40" w:type="dxa"/>
-              <w:right w:w="40" w:type="dxa"/>
-            </w:tcMar>
-          </w:tcPr>
-          <w:p>
-            <w:pPr>
-              <w:jc w:val="center"/>
-            </w:pPr>
-            <w:r>
-              <w:rPr>
-                <w:sz w:val="17"/>
-              </w:rPr>
-              <w:t>44.0</w:t>
-            </w:r>
-          </w:p>
-        </w:tc>
-        <w:tc>
-          <w:tcPr>
-            <w:tcW w:type="dxa" w:w="1419"/>
-            <w:tcMar>
-              <w:top w:w="40" w:type="dxa"/>
-              <w:bottom w:w="40" w:type="dxa"/>
-              <w:left w:w="40" w:type="dxa"/>
-              <w:right w:w="40" w:type="dxa"/>
-            </w:tcMar>
-          </w:tcPr>
-          <w:p>
-            <w:pPr>
-              <w:jc w:val="center"/>
-            </w:pPr>
-            <w:r>
-              <w:rPr>
-                <w:sz w:val="17"/>
-              </w:rPr>
-              <w:t>0.18</w:t>
-            </w:r>
-          </w:p>
-        </w:tc>
-        <w:tc>
-          <w:tcPr>
-            <w:tcW w:type="dxa" w:w="1419"/>
-            <w:tcMar>
-              <w:top w:w="40" w:type="dxa"/>
-              <w:bottom w:w="40" w:type="dxa"/>
-              <w:left w:w="40" w:type="dxa"/>
-              <w:right w:w="40" w:type="dxa"/>
-            </w:tcMar>
-          </w:tcPr>
-          <w:p>
-            <w:pPr>
-              <w:jc w:val="center"/>
-            </w:pPr>
-            <w:r>
-              <w:rPr>
-                <w:sz w:val="17"/>
-              </w:rPr>
-              <w:t>151.8</w:t>
-            </w:r>
-          </w:p>
-        </w:tc>
-        <w:tc>
-          <w:tcPr>
-            <w:tcW w:type="dxa" w:w="1419"/>
-            <w:tcMar>
-              <w:top w:w="40" w:type="dxa"/>
-              <w:bottom w:w="40" w:type="dxa"/>
-              <w:left w:w="40" w:type="dxa"/>
-              <w:right w:w="40" w:type="dxa"/>
-            </w:tcMar>
-          </w:tcPr>
-          <w:p>
-            <w:pPr>
-              <w:jc w:val="center"/>
-            </w:pPr>
-            <w:r>
-              <w:rPr>
-                <w:sz w:val="17"/>
-              </w:rPr>
-              <w:t>110.7</w:t>
-            </w:r>
-          </w:p>
-        </w:tc>
-        <w:tc>
-          <w:tcPr>
-            <w:tcW w:type="dxa" w:w="1419"/>
-            <w:tcMar>
-              <w:top w:w="40" w:type="dxa"/>
-              <w:bottom w:w="40" w:type="dxa"/>
-              <w:left w:w="40" w:type="dxa"/>
-              <w:right w:w="40" w:type="dxa"/>
-            </w:tcMar>
-          </w:tcPr>
-          <w:p>
-            <w:pPr>
-              <w:jc w:val="center"/>
-            </w:pPr>
-            <w:r>
-              <w:rPr>
-                <w:sz w:val="17"/>
-              </w:rPr>
-              <w:t>0.22</w:t>
-            </w:r>
-          </w:p>
-        </w:tc>
-      </w:tr>
-      <w:tr>
-        <w:tc>
-          <w:tcPr>
-            <w:tcW w:type="dxa" w:w="1419"/>
-            <w:tcMar>
-              <w:top w:w="40" w:type="dxa"/>
-              <w:bottom w:w="40" w:type="dxa"/>
-              <w:left w:w="40" w:type="dxa"/>
-              <w:right w:w="40" w:type="dxa"/>
-            </w:tcMar>
-          </w:tcPr>
-          <w:p>
-            <w:r>
-              <w:rPr>
-                <w:b/>
-                <w:sz w:val="17"/>
-              </w:rPr>
-              <w:t>DAG-GNN</w:t>
-            </w:r>
-          </w:p>
-        </w:tc>
-        <w:tc>
-          <w:tcPr>
-            <w:tcW w:type="dxa" w:w="1419"/>
-            <w:tcMar>
-              <w:top w:w="40" w:type="dxa"/>
-              <w:bottom w:w="40" w:type="dxa"/>
-              <w:left w:w="40" w:type="dxa"/>
-              <w:right w:w="40" w:type="dxa"/>
-            </w:tcMar>
-          </w:tcPr>
-          <w:p>
-            <w:pPr>
-              <w:jc w:val="center"/>
-            </w:pPr>
-            <w:r>
-              <w:rPr>
-                <w:sz w:val="17"/>
-              </w:rPr>
-              <w:t>16.0</w:t>
-            </w:r>
-          </w:p>
-        </w:tc>
-        <w:tc>
-          <w:tcPr>
-            <w:tcW w:type="dxa" w:w="1419"/>
-            <w:tcMar>
-              <w:top w:w="40" w:type="dxa"/>
-              <w:bottom w:w="40" w:type="dxa"/>
-              <w:left w:w="40" w:type="dxa"/>
-              <w:right w:w="40" w:type="dxa"/>
-            </w:tcMar>
-          </w:tcPr>
-          <w:p>
-            <w:pPr>
-              <w:jc w:val="center"/>
-            </w:pPr>
-            <w:r>
-              <w:rPr>
-                <w:sz w:val="17"/>
-              </w:rPr>
-              <w:t>44.0</w:t>
-            </w:r>
-          </w:p>
-        </w:tc>
-        <w:tc>
-          <w:tcPr>
-            <w:tcW w:type="dxa" w:w="1419"/>
-            <w:tcMar>
-              <w:top w:w="40" w:type="dxa"/>
-              <w:bottom w:w="40" w:type="dxa"/>
-              <w:left w:w="40" w:type="dxa"/>
-              <w:right w:w="40" w:type="dxa"/>
-            </w:tcMar>
-          </w:tcPr>
-          <w:p>
-            <w:pPr>
-              <w:jc w:val="center"/>
-            </w:pPr>
-            <w:r>
-              <w:rPr>
-                <w:sz w:val="17"/>
-              </w:rPr>
-              <w:t>0.14</w:t>
-            </w:r>
-          </w:p>
-        </w:tc>
-        <w:tc>
-          <w:tcPr>
-            <w:tcW w:type="dxa" w:w="1419"/>
-            <w:tcMar>
-              <w:top w:w="40" w:type="dxa"/>
-              <w:bottom w:w="40" w:type="dxa"/>
-              <w:left w:w="40" w:type="dxa"/>
-              <w:right w:w="40" w:type="dxa"/>
-            </w:tcMar>
-          </w:tcPr>
-          <w:p>
-            <w:pPr>
-              <w:jc w:val="center"/>
-            </w:pPr>
-            <w:r>
-              <w:rPr>
-                <w:sz w:val="17"/>
-              </w:rPr>
-              <w:t>93.6</w:t>
-            </w:r>
-          </w:p>
-        </w:tc>
-        <w:tc>
-          <w:tcPr>
-            <w:tcW w:type="dxa" w:w="1419"/>
-            <w:tcMar>
-              <w:top w:w="40" w:type="dxa"/>
-              <w:bottom w:w="40" w:type="dxa"/>
-              <w:left w:w="40" w:type="dxa"/>
-              <w:right w:w="40" w:type="dxa"/>
-            </w:tcMar>
-          </w:tcPr>
-          <w:p>
-            <w:pPr>
-              <w:jc w:val="center"/>
-            </w:pPr>
-            <w:r>
-              <w:rPr>
-                <w:sz w:val="17"/>
-              </w:rPr>
-              <w:t>157.5</w:t>
-            </w:r>
-          </w:p>
-        </w:tc>
-        <w:tc>
-          <w:tcPr>
-            <w:tcW w:type="dxa" w:w="1419"/>
-            <w:tcMar>
-              <w:top w:w="40" w:type="dxa"/>
-              <w:bottom w:w="40" w:type="dxa"/>
-              <w:left w:w="40" w:type="dxa"/>
-              <w:right w:w="40" w:type="dxa"/>
-            </w:tcMar>
-          </w:tcPr>
-          <w:p>
-            <w:pPr>
-              <w:jc w:val="center"/>
-            </w:pPr>
-            <w:r>
-              <w:rPr>
-                <w:sz w:val="17"/>
-              </w:rPr>
-              <w:t>0.16</w:t>
-            </w:r>
-          </w:p>
-        </w:tc>
-      </w:tr>
-      <w:tr>
-        <w:tc>
-          <w:tcPr>
-            <w:tcW w:type="dxa" w:w="1419"/>
-            <w:tcMar>
-              <w:top w:w="40" w:type="dxa"/>
-              <w:bottom w:w="40" w:type="dxa"/>
-              <w:left w:w="40" w:type="dxa"/>
-              <w:right w:w="40" w:type="dxa"/>
-            </w:tcMar>
-          </w:tcPr>
-          <w:p>
-            <w:r>
-              <w:rPr>
-                <w:b/>
-                <w:sz w:val="17"/>
-              </w:rPr>
-              <w:t>GraN-DAG [15]</w:t>
-            </w:r>
-          </w:p>
-        </w:tc>
-        <w:tc>
-          <w:tcPr>
-            <w:tcW w:type="dxa" w:w="1419"/>
-            <w:tcMar>
-              <w:top w:w="40" w:type="dxa"/>
-              <w:bottom w:w="40" w:type="dxa"/>
-              <w:left w:w="40" w:type="dxa"/>
-              <w:right w:w="40" w:type="dxa"/>
-            </w:tcMar>
-          </w:tcPr>
-          <w:p>
-            <w:pPr>
-              <w:jc w:val="center"/>
-            </w:pPr>
-            <w:r>
-              <w:rPr>
-                <w:sz w:val="17"/>
-              </w:rPr>
-              <w:t>13.0</w:t>
-            </w:r>
-          </w:p>
-        </w:tc>
-        <w:tc>
-          <w:tcPr>
-            <w:tcW w:type="dxa" w:w="1419"/>
-            <w:tcMar>
-              <w:top w:w="40" w:type="dxa"/>
-              <w:bottom w:w="40" w:type="dxa"/>
-              <w:left w:w="40" w:type="dxa"/>
-              <w:right w:w="40" w:type="dxa"/>
-            </w:tcMar>
-          </w:tcPr>
-          <w:p>
-            <w:pPr>
-              <w:jc w:val="center"/>
-            </w:pPr>
-            <w:r>
-              <w:rPr>
-                <w:sz w:val="17"/>
-              </w:rPr>
-              <w:t>47.0</w:t>
-            </w:r>
-          </w:p>
-        </w:tc>
-        <w:tc>
-          <w:tcPr>
-            <w:tcW w:type="dxa" w:w="1419"/>
-            <w:tcMar>
-              <w:top w:w="40" w:type="dxa"/>
-              <w:bottom w:w="40" w:type="dxa"/>
-              <w:left w:w="40" w:type="dxa"/>
-              <w:right w:w="40" w:type="dxa"/>
-            </w:tcMar>
-          </w:tcPr>
-          <w:p>
-            <w:pPr>
-              <w:jc w:val="center"/>
-            </w:pPr>
-            <w:r>
-              <w:rPr>
-                <w:sz w:val="17"/>
-              </w:rPr>
-              <w:t>0.08</w:t>
-            </w:r>
-          </w:p>
-        </w:tc>
-        <w:tc>
-          <w:tcPr>
-            <w:tcW w:type="dxa" w:w="1419"/>
-            <w:tcMar>
-              <w:top w:w="40" w:type="dxa"/>
-              <w:bottom w:w="40" w:type="dxa"/>
-              <w:left w:w="40" w:type="dxa"/>
-              <w:right w:w="40" w:type="dxa"/>
-            </w:tcMar>
-          </w:tcPr>
-          <w:p>
-            <w:pPr>
-              <w:jc w:val="center"/>
-            </w:pPr>
-            <w:r>
-              <w:rPr>
-                <w:sz w:val="17"/>
-              </w:rPr>
-              <w:t>34.0</w:t>
-            </w:r>
-          </w:p>
-        </w:tc>
-        <w:tc>
-          <w:tcPr>
-            <w:tcW w:type="dxa" w:w="1419"/>
-            <w:tcMar>
-              <w:top w:w="40" w:type="dxa"/>
-              <w:bottom w:w="40" w:type="dxa"/>
-              <w:left w:w="40" w:type="dxa"/>
-              <w:right w:w="40" w:type="dxa"/>
-            </w:tcMar>
-          </w:tcPr>
-          <w:p>
-            <w:pPr>
-              <w:jc w:val="center"/>
-            </w:pPr>
-            <w:r>
-              <w:rPr>
-                <w:sz w:val="17"/>
-              </w:rPr>
-              <w:t>161.7</w:t>
-            </w:r>
-          </w:p>
-        </w:tc>
-        <w:tc>
-          <w:tcPr>
-            <w:tcW w:type="dxa" w:w="1419"/>
-            <w:tcMar>
-              <w:top w:w="40" w:type="dxa"/>
-              <w:bottom w:w="40" w:type="dxa"/>
-              <w:left w:w="40" w:type="dxa"/>
-              <w:right w:w="40" w:type="dxa"/>
-            </w:tcMar>
-          </w:tcPr>
-          <w:p>
-            <w:pPr>
-              <w:jc w:val="center"/>
-            </w:pPr>
-            <w:r>
-              <w:rPr>
-                <w:sz w:val="17"/>
-              </w:rPr>
-              <w:t>0.09</w:t>
-            </w:r>
-          </w:p>
-        </w:tc>
-      </w:tr>
-      <w:tr>
-        <w:tc>
-          <w:tcPr>
-            <w:tcW w:type="dxa" w:w="1419"/>
-            <w:tcMar>
-              <w:top w:w="40" w:type="dxa"/>
-              <w:bottom w:w="40" w:type="dxa"/>
-              <w:left w:w="40" w:type="dxa"/>
-              <w:right w:w="40" w:type="dxa"/>
-            </w:tcMar>
-          </w:tcPr>
-          <w:p>
-            <w:r>
-              <w:rPr>
-                <w:b/>
-                <w:sz w:val="17"/>
-              </w:rPr>
-              <w:t>CAM [8]</w:t>
-            </w:r>
-          </w:p>
-        </w:tc>
-        <w:tc>
-          <w:tcPr>
-            <w:tcW w:type="dxa" w:w="1419"/>
-            <w:tcMar>
-              <w:top w:w="40" w:type="dxa"/>
-              <w:bottom w:w="40" w:type="dxa"/>
-              <w:left w:w="40" w:type="dxa"/>
-              <w:right w:w="40" w:type="dxa"/>
-            </w:tcMar>
-          </w:tcPr>
-          <w:p>
-            <w:pPr>
-              <w:jc w:val="center"/>
-            </w:pPr>
-            <w:r>
-              <w:rPr>
-                <w:sz w:val="17"/>
-              </w:rPr>
-              <w:t>12.0</w:t>
-            </w:r>
-          </w:p>
-        </w:tc>
-        <w:tc>
-          <w:tcPr>
-            <w:tcW w:type="dxa" w:w="1419"/>
-            <w:tcMar>
-              <w:top w:w="40" w:type="dxa"/>
-              <w:bottom w:w="40" w:type="dxa"/>
-              <w:left w:w="40" w:type="dxa"/>
-              <w:right w:w="40" w:type="dxa"/>
-            </w:tcMar>
-          </w:tcPr>
-          <w:p>
-            <w:pPr>
-              <w:jc w:val="center"/>
-            </w:pPr>
-            <w:r>
-              <w:rPr>
-                <w:sz w:val="17"/>
-              </w:rPr>
-              <w:t>55.0</w:t>
-            </w:r>
-          </w:p>
-        </w:tc>
-        <w:tc>
-          <w:tcPr>
-            <w:tcW w:type="dxa" w:w="1419"/>
-            <w:tcMar>
-              <w:top w:w="40" w:type="dxa"/>
-              <w:bottom w:w="40" w:type="dxa"/>
-              <w:left w:w="40" w:type="dxa"/>
-              <w:right w:w="40" w:type="dxa"/>
-            </w:tcMar>
-          </w:tcPr>
-          <w:p>
-            <w:pPr>
-              <w:jc w:val="center"/>
-            </w:pPr>
-            <w:r>
-              <w:rPr>
-                <w:sz w:val="17"/>
-              </w:rPr>
-              <w:t>0.07</w:t>
-            </w:r>
-          </w:p>
-        </w:tc>
-        <w:tc>
-          <w:tcPr>
-            <w:tcW w:type="dxa" w:w="1419"/>
-            <w:tcMar>
-              <w:top w:w="40" w:type="dxa"/>
-              <w:bottom w:w="40" w:type="dxa"/>
-              <w:left w:w="40" w:type="dxa"/>
-              <w:right w:w="40" w:type="dxa"/>
-            </w:tcMar>
-          </w:tcPr>
-          <w:p>
-            <w:pPr>
-              <w:jc w:val="center"/>
-            </w:pPr>
-            <w:r>
-              <w:rPr>
-                <w:sz w:val="17"/>
-              </w:rPr>
-              <w:t>40.5</w:t>
-            </w:r>
-          </w:p>
-        </w:tc>
-        <w:tc>
-          <w:tcPr>
-            <w:tcW w:type="dxa" w:w="1419"/>
-            <w:tcMar>
-              <w:top w:w="40" w:type="dxa"/>
-              <w:bottom w:w="40" w:type="dxa"/>
-              <w:left w:w="40" w:type="dxa"/>
-              <w:right w:w="40" w:type="dxa"/>
-            </w:tcMar>
-          </w:tcPr>
-          <w:p>
-            <w:pPr>
-              <w:jc w:val="center"/>
-            </w:pPr>
-            <w:r>
-              <w:rPr>
-                <w:sz w:val="17"/>
-              </w:rPr>
-              <w:t>152.3</w:t>
-            </w:r>
-          </w:p>
-        </w:tc>
-        <w:tc>
-          <w:tcPr>
-            <w:tcW w:type="dxa" w:w="1419"/>
-            <w:tcMar>
-              <w:top w:w="40" w:type="dxa"/>
-              <w:bottom w:w="40" w:type="dxa"/>
-              <w:left w:w="40" w:type="dxa"/>
-              <w:right w:w="40" w:type="dxa"/>
-            </w:tcMar>
-          </w:tcPr>
-          <w:p>
-            <w:pPr>
-              <w:jc w:val="center"/>
-            </w:pPr>
-            <w:r>
-              <w:rPr>
-                <w:sz w:val="17"/>
-              </w:rPr>
-              <w:t>0.07</w:t>
-            </w:r>
-          </w:p>
-        </w:tc>
-      </w:tr>
-      <w:tr>
-        <w:tc>
-          <w:tcPr>
-            <w:tcW w:type="dxa" w:w="1419"/>
-            <w:tcMar>
-              <w:top w:w="40" w:type="dxa"/>
-              <w:bottom w:w="40" w:type="dxa"/>
-              <w:left w:w="40" w:type="dxa"/>
-              <w:right w:w="40" w:type="dxa"/>
-            </w:tcMar>
-          </w:tcPr>
-          <w:p>
-            <w:r>
-              <w:rPr>
-                <w:b/>
-                <w:sz w:val="17"/>
-              </w:rPr>
-              <w:t>CausalFlowNet (Ours)</w:t>
-            </w:r>
-          </w:p>
-        </w:tc>
-        <w:tc>
-          <w:tcPr>
-            <w:tcW w:type="dxa" w:w="1419"/>
-            <w:tcMar>
-              <w:top w:w="40" w:type="dxa"/>
-              <w:bottom w:w="40" w:type="dxa"/>
-              <w:left w:w="40" w:type="dxa"/>
-              <w:right w:w="40" w:type="dxa"/>
-            </w:tcMar>
-          </w:tcPr>
-          <w:p>
-            <w:pPr>
-              <w:jc w:val="center"/>
-            </w:pPr>
-            <w:r>
-              <w:rPr>
-                <w:sz w:val="17"/>
-              </w:rPr>
-              <w:t>12.0</w:t>
-            </w:r>
-          </w:p>
-        </w:tc>
-        <w:tc>
-          <w:tcPr>
-            <w:tcW w:type="dxa" w:w="1419"/>
-            <w:tcMar>
-              <w:top w:w="40" w:type="dxa"/>
-              <w:bottom w:w="40" w:type="dxa"/>
-              <w:left w:w="40" w:type="dxa"/>
-              <w:right w:w="40" w:type="dxa"/>
-            </w:tcMar>
-          </w:tcPr>
-          <w:p>
-            <w:pPr>
-              <w:jc w:val="center"/>
-            </w:pPr>
-            <w:r>
-              <w:rPr>
-                <w:sz w:val="17"/>
-              </w:rPr>
-              <w:t>37.0</w:t>
-            </w:r>
-          </w:p>
-        </w:tc>
-        <w:tc>
-          <w:tcPr>
-            <w:tcW w:type="dxa" w:w="1419"/>
-            <w:tcMar>
-              <w:top w:w="40" w:type="dxa"/>
-              <w:bottom w:w="40" w:type="dxa"/>
-              <w:left w:w="40" w:type="dxa"/>
-              <w:right w:w="40" w:type="dxa"/>
-            </w:tcMar>
-          </w:tcPr>
-          <w:p>
-            <w:pPr>
-              <w:jc w:val="center"/>
-            </w:pPr>
-            <w:r>
-              <w:rPr>
-                <w:sz w:val="17"/>
-              </w:rPr>
-              <w:t>0.06</w:t>
-            </w:r>
-          </w:p>
-        </w:tc>
-        <w:tc>
-          <w:tcPr>
-            <w:tcW w:type="dxa" w:w="1419"/>
-            <w:tcMar>
-              <w:top w:w="40" w:type="dxa"/>
-              <w:bottom w:w="40" w:type="dxa"/>
-              <w:left w:w="40" w:type="dxa"/>
-              <w:right w:w="40" w:type="dxa"/>
-            </w:tcMar>
-          </w:tcPr>
-          <w:p>
-            <w:pPr>
-              <w:jc w:val="center"/>
-            </w:pPr>
-            <w:r>
-              <w:rPr>
-                <w:sz w:val="17"/>
-              </w:rPr>
-              <w:t>25.0</w:t>
-            </w:r>
-          </w:p>
-        </w:tc>
-        <w:tc>
-          <w:tcPr>
-            <w:tcW w:type="dxa" w:w="1419"/>
-            <w:tcMar>
-              <w:top w:w="40" w:type="dxa"/>
-              <w:bottom w:w="40" w:type="dxa"/>
-              <w:left w:w="40" w:type="dxa"/>
-              <w:right w:w="40" w:type="dxa"/>
-            </w:tcMar>
-          </w:tcPr>
-          <w:p>
-            <w:pPr>
-              <w:jc w:val="center"/>
-            </w:pPr>
-            <w:r>
-              <w:rPr>
-                <w:sz w:val="17"/>
-              </w:rPr>
-              <w:t>166.0</w:t>
-            </w:r>
-          </w:p>
-        </w:tc>
-        <w:tc>
-          <w:tcPr>
-            <w:tcW w:type="dxa" w:w="1419"/>
-            <w:tcMar>
-              <w:top w:w="40" w:type="dxa"/>
-              <w:bottom w:w="40" w:type="dxa"/>
-              <w:left w:w="40" w:type="dxa"/>
-              <w:right w:w="40" w:type="dxa"/>
-            </w:tcMar>
-          </w:tcPr>
-          <w:p>
-            <w:pPr>
-              <w:jc w:val="center"/>
-            </w:pPr>
-            <w:r>
-              <w:rPr>
-                <w:sz w:val="17"/>
-              </w:rPr>
-              <w:t>0.08</w:t>
-            </w:r>
-          </w:p>
-        </w:tc>
-      </w:tr>
-    </w:tbl>
-    <w:p>
-      <w:pPr>
-        <w:spacing w:before="160"/>
-      </w:pPr>
-    </w:p>
-    <w:p>
-      <w:pPr>
-        <w:spacing w:after="120" w:before="0" w:line="240" w:lineRule="auto"/>
-        <w:ind w:firstLine="216"/>
+        <w:spacing w:before="0" w:after="80" w:line="240" w:lineRule="auto"/>
         <w:jc w:val="both"/>
       </w:pPr>
       <w:r>
@@ -1666,30 +2804,16 @@
           <w:rFonts w:ascii="Times New Roman" w:hAnsi="Times New Roman"/>
           <w:b w:val="0"/>
           <w:i w:val="0"/>
-          <w:sz w:val="20"/>
+          <w:color w:val="000000"/>
+          <w:sz w:val="18"/>
+          <w:rFonts w:ascii="Times New Roman" w:hAnsi="Times New Roman"/>
         </w:rPr>
-        <w:t>Kết quả đối chứng trong Bảng 1 cho thấy CausalFlowNet đạt được chỉ số SID (Structural Intervention Distance) thấp nhất trên tập Sachs (37.0 so với 47.0 của GraN-DAG và 55.0 của CAM). Chỉ số SID thấp chứng tỏ các can thiệp do-calculus mô phỏng trên đồ thị tìm được có độ tin cậy và sự chính xác cao nhất dưới góc nhìn y sinh học lâm sàng.</w:t>
+        <w:t>[8] Peters, J., Mooij, J. M., Janzing, D., &amp; Schölkopf, B. (2014). Causal discovery with continuous additive noise models. Journal of Machine Learning Research, 15(1), 2009-2053.</w:t>
       </w:r>
     </w:p>
     <w:p>
       <w:pPr>
-        <w:spacing w:after="60" w:before="120" w:line="240" w:lineRule="auto"/>
-        <w:jc w:val="left"/>
-      </w:pPr>
-      <w:r>
-        <w:rPr>
-          <w:rFonts w:ascii="Times New Roman" w:hAnsi="Times New Roman"/>
-          <w:b/>
-          <w:i w:val="0"/>
-          <w:sz w:val="20"/>
-        </w:rPr>
-        <w:t>3.2 Phân cụm phần dư phát hiện cơ chế ẩn</w:t>
-      </w:r>
-    </w:p>
-    <w:p>
-      <w:pPr>
-        <w:spacing w:after="120" w:before="0" w:line="240" w:lineRule="auto"/>
-        <w:ind w:firstLine="216"/>
+        <w:spacing w:before="0" w:after="80" w:line="240" w:lineRule="auto"/>
         <w:jc w:val="both"/>
       </w:pPr>
       <w:r>
@@ -1697,30 +2821,16 @@
           <w:rFonts w:ascii="Times New Roman" w:hAnsi="Times New Roman"/>
           <w:b w:val="0"/>
           <w:i w:val="0"/>
-          <w:sz w:val="20"/>
+          <w:color w:val="000000"/>
+          <w:sz w:val="18"/>
+          <w:rFonts w:ascii="Times New Roman" w:hAnsi="Times New Roman"/>
         </w:rPr>
-        <w:t>Thông qua cơ chế residual clustering (K-means trên không gian ẩn của NSF), mô hình phân tách thành công tập dữ liệu Sachs thành 5 cụm phản ánh tương đồng sinh lý học. Điều này hoàn toàn khớp với thực tế thí nghiệm khi tập dữ liệu được thu thập dưới 5 điều kiện kích thích và ức chế protein khác nhau, mở ra hướng ứng dụng nhận diện phân nhóm bệnh lý tự động.</w:t>
+        <w:t>[9] Sachs, K., Perez, O., Pe'er, D., Lauffenburger, D. A., &amp; Nolan, G. P. (2005). Causal protein-signaling networks derived from multiparameter single-cell data. Science, 308(5721), 523-529.</w:t>
       </w:r>
     </w:p>
     <w:p>
       <w:pPr>
-        <w:spacing w:after="80" w:before="240" w:line="240" w:lineRule="auto"/>
-        <w:jc w:val="left"/>
-      </w:pPr>
-      <w:r>
-        <w:rPr>
-          <w:rFonts w:ascii="Times New Roman" w:hAnsi="Times New Roman"/>
-          <w:b/>
-          <w:i w:val="0"/>
-          <w:sz w:val="20"/>
-        </w:rPr>
-        <w:t>4. KẾT LUẬN (CONCLUSION)</w:t>
-      </w:r>
-    </w:p>
-    <w:p>
-      <w:pPr>
-        <w:spacing w:after="120" w:before="0" w:line="240" w:lineRule="auto"/>
-        <w:ind w:firstLine="216"/>
+        <w:spacing w:before="0" w:after="80" w:line="240" w:lineRule="auto"/>
         <w:jc w:val="both"/>
       </w:pPr>
       <w:r>
@@ -1728,30 +2838,16 @@
           <w:rFonts w:ascii="Times New Roman" w:hAnsi="Times New Roman"/>
           <w:b w:val="0"/>
           <w:i w:val="0"/>
-          <w:sz w:val="20"/>
+          <w:color w:val="000000"/>
+          <w:sz w:val="18"/>
+          <w:rFonts w:ascii="Times New Roman" w:hAnsi="Times New Roman"/>
         </w:rPr>
-        <w:t>Nghiên cứu đã đề xuất thành công CausalFlowNet - một kiến trúc học sâu tiên tiến phục vụ bài toán khám phá cấu trúc nhân quả phi tuyến tính. Bằng sự kết hợp chặt chẽ giữa Gated-ResMLP khả vi, dòng chuẩn hóa Neural Spline Flows linh hoạt và tiêu chuẩn độc lập Fast HSIC song song, mô hình đã vượt qua các giới hạn tuyến tính và nhiễu Gaussian của các baseline truyền thống. Các kết quả thực nghiệm vượt trội trên tập dữ liệu sinh học thực tế Sachs và mạng gen SynTReN chứng minh tính khả thi và tiềm năng ứng dụng to lớn của phương pháp đề xuất trong phân tích mạng lưới y sinh và hỗ trợ ra quyết định lâm sàng.</w:t>
+        <w:t>[10] Shimizu, S., Hoyer, P. O., Hyvärinen, A., &amp; Kerminen, A. (2006). A linear non-Gaussian acyclic model for causal discovery. Journal of Machine Learning Research, 7(10), 2003-2030.</w:t>
       </w:r>
     </w:p>
     <w:p>
       <w:pPr>
-        <w:spacing w:after="80" w:before="240" w:line="240" w:lineRule="auto"/>
-        <w:jc w:val="left"/>
-      </w:pPr>
-      <w:r>
-        <w:rPr>
-          <w:rFonts w:ascii="Times New Roman" w:hAnsi="Times New Roman"/>
-          <w:b/>
-          <w:i w:val="0"/>
-          <w:sz w:val="20"/>
-        </w:rPr>
-        <w:t>5. CẢM ƠN (ACKNOWLEDGMENTS)</w:t>
-      </w:r>
-    </w:p>
-    <w:p>
-      <w:pPr>
-        <w:spacing w:after="120" w:before="0" w:line="240" w:lineRule="auto"/>
-        <w:ind w:firstLine="216"/>
+        <w:spacing w:before="0" w:after="80" w:line="240" w:lineRule="auto"/>
         <w:jc w:val="both"/>
       </w:pPr>
       <w:r>
@@ -1759,212 +2855,86 @@
           <w:rFonts w:ascii="Times New Roman" w:hAnsi="Times New Roman"/>
           <w:b w:val="0"/>
           <w:i w:val="0"/>
-          <w:sz w:val="20"/>
-        </w:rPr>
-        <w:t>Nhóm tác giả xin chân thành bày tỏ lòng biết ơn sâu sắc đến Thầy Trần Thanh Phương, giảng viên hướng dẫn khoa Công nghệ Thông tin, Trường Đại học Lạc Hồng, vì những định hướng chuyên môn vô cùng quý báu trong suốt quá trình hoàn thiện nghiên cứu này.</w:t>
-      </w:r>
-    </w:p>
-    <w:p>
-      <w:pPr>
-        <w:spacing w:after="80" w:before="240" w:line="240" w:lineRule="auto"/>
-        <w:jc w:val="left"/>
-      </w:pPr>
-      <w:r>
-        <w:rPr>
+          <w:color w:val="000000"/>
+          <w:sz w:val="18"/>
           <w:rFonts w:ascii="Times New Roman" w:hAnsi="Times New Roman"/>
-          <w:b/>
-          <w:i w:val="0"/>
-          <w:sz w:val="20"/>
-        </w:rPr>
-        <w:t>6. TÀI LIỆU THAM KHẢO (REFERENCES)</w:t>
-      </w:r>
-    </w:p>
-    <w:p>
-      <w:pPr>
-        <w:spacing w:after="40" w:line="240" w:lineRule="auto"/>
-        <w:jc w:val="both"/>
-      </w:pPr>
-      <w:r>
-        <w:rPr>
-          <w:rFonts w:ascii="Times New Roman" w:hAnsi="Times New Roman"/>
-          <w:sz w:val="17"/>
-        </w:rPr>
-        <w:t>[1] Bello, K., Aragam, B., &amp; Ravikumar, P. (2022). DAGMA: Learning DAGs via M-matrices and a Log-Determinant Acyclicity Characterization. Advances in Neural Information Processing Systems, 35.</w:t>
-      </w:r>
-    </w:p>
-    <w:p>
-      <w:pPr>
-        <w:spacing w:after="40" w:line="240" w:lineRule="auto"/>
-        <w:jc w:val="both"/>
-      </w:pPr>
-      <w:r>
-        <w:rPr>
-          <w:rFonts w:ascii="Times New Roman" w:hAnsi="Times New Roman"/>
-          <w:sz w:val="17"/>
-        </w:rPr>
-        <w:t>[2] Chickering, D. M. (2002). Optimal structure identification with greedy search. Journal of Machine Learning Research, 3(Nov), 507-554.</w:t>
-      </w:r>
-    </w:p>
-    <w:p>
-      <w:pPr>
-        <w:spacing w:after="40" w:line="240" w:lineRule="auto"/>
-        <w:jc w:val="both"/>
-      </w:pPr>
-      <w:r>
-        <w:rPr>
-          <w:rFonts w:ascii="Times New Roman" w:hAnsi="Times New Roman"/>
-          <w:sz w:val="17"/>
-        </w:rPr>
-        <w:t>[3] Durkan, C., Bekasov, A., Murray, I., &amp; Papamakarios, G. (2019). Neural spline flows. Advances in Neural Information Processing Systems, 32.</w:t>
-      </w:r>
-    </w:p>
-    <w:p>
-      <w:pPr>
-        <w:spacing w:after="40" w:line="240" w:lineRule="auto"/>
-        <w:jc w:val="both"/>
-      </w:pPr>
-      <w:r>
-        <w:rPr>
-          <w:rFonts w:ascii="Times New Roman" w:hAnsi="Times New Roman"/>
-          <w:sz w:val="17"/>
-        </w:rPr>
-        <w:t>[4] Gretton, A., Bousquet, O., Smola, A., &amp; Schölkopf, B. (2005). Measuring statistical dependence with Hilbert-Schmidt norms. In Algorithmic Learning Theory: 16th International Conference, ALT 2005, p. 63-77.</w:t>
-      </w:r>
-    </w:p>
-    <w:p>
-      <w:pPr>
-        <w:spacing w:after="40" w:line="240" w:lineRule="auto"/>
-        <w:jc w:val="both"/>
-      </w:pPr>
-      <w:r>
-        <w:rPr>
-          <w:rFonts w:ascii="Times New Roman" w:hAnsi="Times New Roman"/>
-          <w:sz w:val="17"/>
-        </w:rPr>
-        <w:t>[5] Hu, S., Chen, Z., et al. (2018). Causal Inference and Mechanism Clustering of A Mixture of Additive Noise Models (ANM-MM). Advances in Neural Information Processing Systems (NeurIPS), 31.</w:t>
-      </w:r>
-    </w:p>
-    <w:p>
-      <w:pPr>
-        <w:spacing w:after="40" w:line="240" w:lineRule="auto"/>
-        <w:jc w:val="both"/>
-      </w:pPr>
-      <w:r>
-        <w:rPr>
-          <w:rFonts w:ascii="Times New Roman" w:hAnsi="Times New Roman"/>
-          <w:sz w:val="17"/>
-        </w:rPr>
-        <w:t>[6] Pearl, J. (2000). Causality: Models, Reasoning and Inference. Cambridge University Press.</w:t>
-      </w:r>
-    </w:p>
-    <w:p>
-      <w:pPr>
-        <w:spacing w:after="40" w:line="240" w:lineRule="auto"/>
-        <w:jc w:val="both"/>
-      </w:pPr>
-      <w:r>
-        <w:rPr>
-          <w:rFonts w:ascii="Times New Roman" w:hAnsi="Times New Roman"/>
-          <w:sz w:val="17"/>
-        </w:rPr>
-        <w:t>[7] Peters, J., &amp; Bühlmann, P. (2015). Structural intervention distance for evaluating causal graphs. Neural Computation, 27(3), 771-799.</w:t>
-      </w:r>
-    </w:p>
-    <w:p>
-      <w:pPr>
-        <w:spacing w:after="40" w:line="240" w:lineRule="auto"/>
-        <w:jc w:val="both"/>
-      </w:pPr>
-      <w:r>
-        <w:rPr>
-          <w:rFonts w:ascii="Times New Roman" w:hAnsi="Times New Roman"/>
-          <w:sz w:val="17"/>
-        </w:rPr>
-        <w:t>[8] Peters, J., Mooij, J. M., Janzing, D., &amp; Schölkopf, B. (2014). Causal discovery with continuous additive noise models. Journal of Machine Learning Research, 15(1), 2009-2053.</w:t>
-      </w:r>
-    </w:p>
-    <w:p>
-      <w:pPr>
-        <w:spacing w:after="40" w:line="240" w:lineRule="auto"/>
-        <w:jc w:val="both"/>
-      </w:pPr>
-      <w:r>
-        <w:rPr>
-          <w:rFonts w:ascii="Times New Roman" w:hAnsi="Times New Roman"/>
-          <w:sz w:val="17"/>
-        </w:rPr>
-        <w:t>[9] Sachs, K., Perez, O., Pe'er, D., Lauffenburger, D. A., &amp; Nolan, G. P. (2005). Causal protein-signaling networks derived from multiparameter single-cell data. Science, 308(5721), 523-529.</w:t>
-      </w:r>
-    </w:p>
-    <w:p>
-      <w:pPr>
-        <w:spacing w:after="40" w:line="240" w:lineRule="auto"/>
-        <w:jc w:val="both"/>
-      </w:pPr>
-      <w:r>
-        <w:rPr>
-          <w:rFonts w:ascii="Times New Roman" w:hAnsi="Times New Roman"/>
-          <w:sz w:val="17"/>
-        </w:rPr>
-        <w:t>[10] Shimizu, S., Hoyer, P. O., Hyvärinen, A., &amp; Kerminen, A. (2006). A linear non-Gaussian acyclic model for causal discovery. Journal of Machine Learning Research, 7(10), 2003-2030.</w:t>
-      </w:r>
-    </w:p>
-    <w:p>
-      <w:pPr>
-        <w:spacing w:after="40" w:line="240" w:lineRule="auto"/>
-        <w:jc w:val="both"/>
-      </w:pPr>
-      <w:r>
-        <w:rPr>
-          <w:rFonts w:ascii="Times New Roman" w:hAnsi="Times New Roman"/>
-          <w:sz w:val="17"/>
         </w:rPr>
         <w:t>[11] Spirtes, P., Glymour, C. N., &amp; Scheines, R. (2000). Causation, prediction, and search (2nd ed.). MIT Press.</w:t>
       </w:r>
     </w:p>
     <w:p>
       <w:pPr>
-        <w:spacing w:after="40" w:line="240" w:lineRule="auto"/>
+        <w:spacing w:before="0" w:after="80" w:line="240" w:lineRule="auto"/>
         <w:jc w:val="both"/>
       </w:pPr>
       <w:r>
         <w:rPr>
           <w:rFonts w:ascii="Times New Roman" w:hAnsi="Times New Roman"/>
-          <w:sz w:val="17"/>
+          <w:b w:val="0"/>
+          <w:i w:val="0"/>
+          <w:color w:val="000000"/>
+          <w:sz w:val="18"/>
+          <w:rFonts w:ascii="Times New Roman" w:hAnsi="Times New Roman"/>
         </w:rPr>
         <w:t>[12] Van den Bulcke, T., Van Leemput, K., Naudts, B., van Remortel, P., Ma, H., Verschoren, A., De Moor, B., &amp; Marchal, K. (2006). SynTReN: a generator of synthetic gene expression data for design and analysis of structure learning algorithms. BMC Bioinformatics, 7(1), 43.</w:t>
       </w:r>
     </w:p>
     <w:p>
       <w:pPr>
-        <w:spacing w:after="40" w:line="240" w:lineRule="auto"/>
+        <w:spacing w:before="0" w:after="80" w:line="240" w:lineRule="auto"/>
         <w:jc w:val="both"/>
       </w:pPr>
       <w:r>
         <w:rPr>
           <w:rFonts w:ascii="Times New Roman" w:hAnsi="Times New Roman"/>
-          <w:sz w:val="17"/>
+          <w:b w:val="0"/>
+          <w:i w:val="0"/>
+          <w:color w:val="000000"/>
+          <w:sz w:val="18"/>
+          <w:rFonts w:ascii="Times New Roman" w:hAnsi="Times New Roman"/>
         </w:rPr>
         <w:t>[13] Zheng, X., Aragam, B., Ravikumar, P. K., &amp; Xing, E. P. (2018). DAGs with NO TEARS: Continuous optimization for structure learning. Advances in Neural Information Processing Systems, 31.</w:t>
       </w:r>
     </w:p>
     <w:p>
       <w:pPr>
-        <w:spacing w:after="40" w:line="240" w:lineRule="auto"/>
+        <w:spacing w:before="0" w:after="80" w:line="240" w:lineRule="auto"/>
         <w:jc w:val="both"/>
       </w:pPr>
       <w:r>
         <w:rPr>
           <w:rFonts w:ascii="Times New Roman" w:hAnsi="Times New Roman"/>
-          <w:sz w:val="17"/>
+          <w:b w:val="0"/>
+          <w:i w:val="0"/>
+          <w:color w:val="000000"/>
+          <w:sz w:val="18"/>
+          <w:rFonts w:ascii="Times New Roman" w:hAnsi="Times New Roman"/>
         </w:rPr>
-        <w:t>[14] Lachapelle, S., Brouillard, P., Deleu, T., &amp; Lacoste-Julien, S. (2020). Gradient-Based Neural DAG Learning. arXiv preprint arXiv:1906.02226.</w:t>
+        <w:t>[14] Hu, S., Chen, Z., Partovi Nia, V., Chan, L., &amp; Geng, Y. (2018). Causal Inference and Mechanism Clustering of A Mixture of Additive Noise Models. Poster presented at NeurIPS 2018.</w:t>
+      </w:r>
+    </w:p>
+    <w:p>
+      <w:pPr>
+        <w:spacing w:before="0" w:after="80" w:line="240" w:lineRule="auto"/>
+        <w:jc w:val="both"/>
+      </w:pPr>
+      <w:r>
+        <w:rPr>
+          <w:rFonts w:ascii="Times New Roman" w:hAnsi="Times New Roman"/>
+          <w:b w:val="0"/>
+          <w:i w:val="0"/>
+          <w:color w:val="000000"/>
+          <w:sz w:val="18"/>
+          <w:rFonts w:ascii="Times New Roman" w:hAnsi="Times New Roman"/>
+        </w:rPr>
+        <w:t>[15] Lachapelle, S., Brouillard, P., Deleu, T., &amp; Lacoste-Julien, S. (2020). Gradient-Based Neural DAG Learning. arXiv preprint arXiv:1906.02226.</w:t>
       </w:r>
     </w:p>
     <w:sectPr>
+      <w:type w:val="continuous"/>
       <w:pgSz w:w="11909" w:h="16834"/>
-      <w:pgMar w:top="850" w:right="562" w:bottom="850" w:left="1411" w:header="720" w:footer="720" w:gutter="0"/>
-      <w:cols w:space="720" w:num="2"/>
+      <w:pgMar w:top="851" w:right="567" w:bottom="851" w:left="1417" w:header="720" w:footer="720" w:gutter="0"/>
+      <w:cols w:space="480" w:num="2"/>
       <w:docGrid w:linePitch="360"/>
     </w:sectPr>
   </w:body>
@@ -2334,10 +3304,6 @@
     <w:name w:val="Normal"/>
     <w:qFormat/>
     <w:rsid w:val="00FC693F"/>
-    <w:rPr>
-      <w:rFonts w:ascii="Times New Roman" w:hAnsi="Times New Roman"/>
-      <w:sz w:val="20"/>
-    </w:rPr>
   </w:style>
   <w:style w:type="paragraph" w:styleId="Header">
     <w:name w:val="header"/>

</xml_diff>